<commit_message>
fixed nginx and downloading files from the store
</commit_message>
<xml_diff>
--- a/docs/report.docx
+++ b/docs/report.docx
@@ -96,13 +96,10 @@
         <w:t xml:space="preserve">ICMS </w:t>
       </w:r>
       <w:r>
-        <w:t>In</w:t>
-      </w:r>
-      <w:r>
-        <w:t>-</w:t>
-      </w:r>
-      <w:r>
-        <w:t>depth system</w:t>
+        <w:t>surface level</w:t>
+      </w:r>
+      <w:r>
+        <w:t xml:space="preserve"> system</w:t>
       </w:r>
       <w:r>
         <w:t xml:space="preserve"> look</w:t>
@@ -198,7 +195,37 @@
       </w:r>
     </w:p>
     <w:p/>
-    <w:p/>
+    <w:p>
+      <w:r>
+        <w:t>Protecting users and their data</w:t>
+      </w:r>
+    </w:p>
+    <w:p>
+      <w:r>
+        <w:t>Cross-Site</w:t>
+      </w:r>
+      <w:r>
+        <w:t xml:space="preserve"> </w:t>
+      </w:r>
+      <w:r>
+        <w:t>Scripting</w:t>
+      </w:r>
+      <w:r>
+        <w:t xml:space="preserve"> attacks</w:t>
+      </w:r>
+      <w:r>
+        <w:t>, SQL injection,</w:t>
+      </w:r>
+      <w:r>
+        <w:t xml:space="preserve"> CSRF attacks</w:t>
+      </w:r>
+      <w:r>
+        <w:t xml:space="preserve"> (sveltekit protection)</w:t>
+      </w:r>
+      <w:r>
+        <w:t xml:space="preserve"> </w:t>
+      </w:r>
+    </w:p>
     <w:p/>
     <w:p/>
     <w:p/>
@@ -210,6 +237,19 @@
     </w:p>
     <w:p>
       <w:r>
+        <w:t>In the past creating new low power devices was far more difficult than now. Technology has now advanced to a point where low power devices are significantly more accessible to the average hobbyist or developer because they are so much cheaper. Devices such as raspberry pi’s and esp32’s can be ordered for as little as £10 with access to Bluetooth and WIFI that rival that of mobile devices such as phones and laptops for dramatically less of a cost.</w:t>
+      </w:r>
+    </w:p>
+    <w:p>
+      <w:r>
+        <w:t xml:space="preserve">As different devices have been released the communities around them have also continued to be built. More specifically, more hardware such as screens, adapter boards have been designed and built for cheaper and cheaper prices. Because of these prices, hardware has become more and more split between devices as different manufacturers develop their own unique software and hardware. </w:t>
+      </w:r>
+    </w:p>
+    <w:p/>
+    <w:p/>
+    <w:p>
+      <w:r>
+        <w:lastRenderedPageBreak/>
         <w:t xml:space="preserve">Ultra </w:t>
       </w:r>
       <w:r>
@@ -218,63 +258,223 @@
     </w:p>
     <w:p>
       <w:r>
+        <w:t>Many different devices come with different modes for how their power is managed.</w:t>
+      </w:r>
+      <w:r>
+        <w:t xml:space="preserve"> </w:t>
+      </w:r>
+    </w:p>
+    <w:p>
+      <w:r>
+        <w:t xml:space="preserve">This ultra-low power usage does come at the cost of performance and latency.  </w:t>
+      </w:r>
+    </w:p>
+    <w:p/>
+    <w:p>
+      <w:r>
         <w:t>Connection methods (Wi-Fi, Bluetooth)</w:t>
       </w:r>
     </w:p>
     <w:p>
       <w:r>
+        <w:t>Wi-Fi is one of the most widely used methods of connecting and using an IOT device.</w:t>
+      </w:r>
+      <w:r>
+        <w:t xml:space="preserve"> This is most due to the fact that most devices within a household</w:t>
+      </w:r>
+      <w:r>
+        <w:t xml:space="preserve"> such as mobile devices, PC’s, gaming consoles and routers all</w:t>
+      </w:r>
+      <w:r>
+        <w:t xml:space="preserve"> use Wi-Fi</w:t>
+      </w:r>
+      <w:r>
+        <w:t xml:space="preserve"> and</w:t>
+      </w:r>
+      <w:r>
+        <w:t xml:space="preserve"> as a result, </w:t>
+      </w:r>
+      <w:r>
+        <w:t>the average household is more likely to have the hardware.</w:t>
+      </w:r>
+      <w:r>
+        <w:t xml:space="preserve"> </w:t>
+      </w:r>
+    </w:p>
+    <w:p>
+      <w:r>
+        <w:t xml:space="preserve">Examples of IOT devices that also utilise this connection method are </w:t>
+      </w:r>
+      <w:r>
+        <w:t>h</w:t>
+      </w:r>
+      <w:r>
+        <w:t xml:space="preserve">ome </w:t>
+      </w:r>
+      <w:r>
+        <w:t>a</w:t>
+      </w:r>
+      <w:r>
+        <w:t>ssistants such as Amazon Alex</w:t>
+      </w:r>
+      <w:r>
+        <w:t>a and</w:t>
+      </w:r>
+      <w:r>
+        <w:t xml:space="preserve"> Google Home.</w:t>
+      </w:r>
+    </w:p>
+    <w:p/>
+    <w:p>
+      <w:r>
+        <w:t xml:space="preserve">Bluetooth is another method of connecting devices that has slowly phased out of relevance due to security issues and range limitations. Bluetooth can still be found being used for less secure devices due to the ease of connection, for example, in Bluetooth headphones. </w:t>
+      </w:r>
+      <w:r>
+        <w:t xml:space="preserve"> </w:t>
+      </w:r>
+    </w:p>
+    <w:p/>
+    <w:p>
+      <w:r>
+        <w:t>Zigbee</w:t>
+      </w:r>
+      <w:r>
+        <w:t xml:space="preserve"> is a relatively new protocol for IOT devices that has begun to gain more and more traction in the past few years. </w:t>
+      </w:r>
+    </w:p>
+    <w:p>
+      <w:r>
+        <w:t>The main drawback of using the Zigbee technology is the requirement of having to use proprietary hardware to convert back and forwards between different protocols. As a result, this can cause projects to become significantly more expensive than using the traditional Wi-Fi</w:t>
+      </w:r>
+      <w:r>
+        <w:t xml:space="preserve"> hardware</w:t>
+      </w:r>
+      <w:r>
+        <w:t xml:space="preserve">. </w:t>
+      </w:r>
+    </w:p>
+    <w:p/>
+    <w:p>
+      <w:r>
         <w:t>Raspberry Pi’s, Pico’s, esp32 and other devices</w:t>
       </w:r>
     </w:p>
     <w:p/>
-    <w:p>
-      <w:r>
-        <w:t>Zigbee</w:t>
-      </w:r>
-      <w:r>
-        <w:t xml:space="preserve"> is a relatively new protocol for IOT devices that has begun to gain more and more traction in the past few years. </w:t>
-      </w:r>
-    </w:p>
-    <w:p>
-      <w:r>
-        <w:t>The main drawback of using the Zigbee technology is the requirement of having to use proprietary hardware</w:t>
-      </w:r>
-      <w:r>
-        <w:t xml:space="preserve"> to convert back and forwards between different protocols</w:t>
+    <w:p/>
+    <w:p/>
+    <w:p/>
+    <w:p/>
+    <w:p/>
+    <w:p>
+      <w:r>
+        <w:t>Home assistant</w:t>
+      </w:r>
+    </w:p>
+    <w:p>
+      <w:r>
+        <w:t xml:space="preserve">Home assistant is an </w:t>
+      </w:r>
+      <w:r>
+        <w:t>open-source</w:t>
+      </w:r>
+      <w:r>
+        <w:t xml:space="preserve"> software also written in python. It allows the user to automate and connected devices similarly to ICMS. </w:t>
+      </w:r>
+      <w:r>
+        <w:t xml:space="preserve">The main differences between the two pieces of software </w:t>
+      </w:r>
+      <w:r>
+        <w:t>are</w:t>
+      </w:r>
+      <w:r>
+        <w:t xml:space="preserve"> that ICMS is designed for developers or hobbyists to design and built their own devices, while home assistant </w:t>
+      </w:r>
+      <w:r>
+        <w:t>is designed for connecting already built devices</w:t>
+      </w:r>
+      <w:r>
+        <w:t xml:space="preserve"> with software designed by the manufacturer</w:t>
       </w:r>
       <w:r>
         <w:t>.</w:t>
       </w:r>
-      <w:r>
-        <w:t xml:space="preserve"> As a </w:t>
-      </w:r>
-      <w:r>
-        <w:t>result,</w:t>
+    </w:p>
+    <w:p>
+      <w:r>
+        <w:lastRenderedPageBreak/>
+        <w:t>Comparison graph here</w:t>
+      </w:r>
+    </w:p>
+    <w:p/>
+    <w:p/>
+    <w:p/>
+    <w:p/>
+    <w:p>
+      <w:r>
+        <w:t>Software a</w:t>
+      </w:r>
+      <w:r>
+        <w:t>rchitecture and graphs</w:t>
+      </w:r>
+    </w:p>
+    <w:p>
+      <w:r>
+        <w:t>ICMS was designed with extensibility as</w:t>
       </w:r>
       <w:r>
         <w:t xml:space="preserve"> </w:t>
       </w:r>
       <w:r>
-        <w:t xml:space="preserve">this can </w:t>
-      </w:r>
-      <w:r>
-        <w:t xml:space="preserve">cause projects to become </w:t>
-      </w:r>
-      <w:r>
-        <w:t xml:space="preserve">significantly more expensive than using the traditional Wi-Fi system. </w:t>
-      </w:r>
-    </w:p>
-    <w:p/>
-    <w:p/>
-    <w:p/>
-    <w:p>
-      <w:r>
-        <w:t>Software a</w:t>
-      </w:r>
-      <w:r>
-        <w:t>rchitecture and graphs</w:t>
-      </w:r>
-    </w:p>
+        <w:t>priority</w:t>
+      </w:r>
+      <w:r>
+        <w:t xml:space="preserve"> one</w:t>
+      </w:r>
+      <w:r>
+        <w:t xml:space="preserve">. </w:t>
+      </w:r>
+    </w:p>
+    <w:p>
+      <w:r>
+        <w:t>Having the ability to add and remove different pieces of the software through extensions required a very modular design.</w:t>
+      </w:r>
+    </w:p>
+    <w:p>
+      <w:r>
+        <w:t>To do this, extensions are loaded before any of the other parts of the software are started. They are loaded dynamically</w:t>
+      </w:r>
+      <w:r>
+        <w:t xml:space="preserve"> b</w:t>
+      </w:r>
+      <w:r>
+        <w:t>y</w:t>
+      </w:r>
+      <w:r>
+        <w:t xml:space="preserve"> importing the library a</w:t>
+      </w:r>
+      <w:r>
+        <w:t xml:space="preserve">t </w:t>
+      </w:r>
+      <w:r>
+        <w:t>runtime though pythons importlib library</w:t>
+      </w:r>
+      <w:r>
+        <w:t>.</w:t>
+      </w:r>
+      <w:r>
+        <w:t xml:space="preserve"> This uses the json file found in the settings folder to determine what to import and where it can be found.</w:t>
+      </w:r>
+      <w:r>
+        <w:t xml:space="preserve"> </w:t>
+      </w:r>
+      <w:r>
+        <w:t>By doing it this way</w:t>
+      </w:r>
+      <w:r>
+        <w:t xml:space="preserve"> it simplifies the usage as nothing other than an easily accessible json file needs to be changed. </w:t>
+      </w:r>
+    </w:p>
+    <w:p/>
     <w:p/>
     <w:p>
       <w:r>
@@ -315,6 +515,12 @@
     </w:p>
     <w:p>
       <w:r>
+        <w:t>Thread safe and non-thread safe</w:t>
+      </w:r>
+    </w:p>
+    <w:p/>
+    <w:p>
+      <w:r>
         <w:t>Extending an application</w:t>
       </w:r>
     </w:p>
@@ -353,6 +559,7 @@
     <w:p/>
     <w:p>
       <w:r>
+        <w:lastRenderedPageBreak/>
         <w:t xml:space="preserve">Ease of development vs </w:t>
       </w:r>
       <w:r>
@@ -1098,6 +1305,7 @@
   <w:style w:type="character" w:default="1" w:styleId="DefaultParagraphFont">
     <w:name w:val="Default Paragraph Font"/>
     <w:uiPriority w:val="1"/>
+    <w:semiHidden/>
     <w:unhideWhenUsed/>
   </w:style>
   <w:style w:type="table" w:default="1" w:styleId="TableNormal">

</xml_diff>

<commit_message>
updated docs and attempted to fix local server running
</commit_message>
<xml_diff>
--- a/docs/report.docx
+++ b/docs/report.docx
@@ -324,7 +324,6 @@
         <w:t xml:space="preserve"> Google Home.</w:t>
       </w:r>
     </w:p>
-    <w:p/>
     <w:p>
       <w:r>
         <w:t xml:space="preserve">Bluetooth is another method of connecting devices that has slowly phased out of relevance due to security issues and range limitations. Bluetooth can still be found being used for less secure devices due to the ease of connection, for example, in Bluetooth headphones. </w:t>
@@ -333,7 +332,6 @@
         <w:t xml:space="preserve"> </w:t>
       </w:r>
     </w:p>
-    <w:p/>
     <w:p>
       <w:r>
         <w:t>Zigbee</w:t>
@@ -362,9 +360,6 @@
     <w:p/>
     <w:p/>
     <w:p/>
-    <w:p/>
-    <w:p/>
-    <w:p/>
     <w:p>
       <w:r>
         <w:t>Home assistant</w:t>
@@ -401,16 +396,16 @@
     </w:p>
     <w:p>
       <w:r>
+        <w:t>Comparison graph here</w:t>
+      </w:r>
+    </w:p>
+    <w:p/>
+    <w:p/>
+    <w:p/>
+    <w:p/>
+    <w:p>
+      <w:r>
         <w:lastRenderedPageBreak/>
-        <w:t>Comparison graph here</w:t>
-      </w:r>
-    </w:p>
-    <w:p/>
-    <w:p/>
-    <w:p/>
-    <w:p/>
-    <w:p>
-      <w:r>
         <w:t>Software a</w:t>
       </w:r>
       <w:r>
@@ -439,41 +434,521 @@
         <w:t>Having the ability to add and remove different pieces of the software through extensions required a very modular design.</w:t>
       </w:r>
     </w:p>
-    <w:p>
-      <w:r>
-        <w:t>To do this, extensions are loaded before any of the other parts of the software are started. They are loaded dynamically</w:t>
-      </w:r>
-      <w:r>
-        <w:t xml:space="preserve"> b</w:t>
+    <w:p/>
+    <w:p>
+      <w:r>
+        <w:t>Svelte</w:t>
+      </w:r>
+      <w:r>
+        <w:t>/</w:t>
+      </w:r>
+      <w:r>
+        <w:t>Svelte kit</w:t>
+      </w:r>
+    </w:p>
+    <w:p>
+      <w:r>
+        <w:t>Svelte is a relatively new web framework, building off of what has been learn</w:t>
+      </w:r>
+      <w:r>
+        <w:t>t</w:t>
+      </w:r>
+      <w:r>
+        <w:t xml:space="preserve"> with other frameworks such as a React</w:t>
+      </w:r>
+      <w:r>
+        <w:t xml:space="preserve"> it has many modern </w:t>
+      </w:r>
+      <w:r>
+        <w:t>JavaScript</w:t>
+      </w:r>
+      <w:r>
+        <w:t xml:space="preserve"> and web features</w:t>
+      </w:r>
+      <w:r>
+        <w:t>.</w:t>
+      </w:r>
+    </w:p>
+    <w:p>
+      <w:r>
+        <w:t>For example, one of the key features is their implementation of server</w:t>
+      </w:r>
+      <w:r>
+        <w:t>-</w:t>
+      </w:r>
+      <w:r>
+        <w:t>side rendering (SSR).</w:t>
+      </w:r>
+      <w:r>
+        <w:t xml:space="preserve"> </w:t>
+      </w:r>
+      <w:r>
+        <w:t xml:space="preserve">Server-side rendering allows the server to render the web page before sending it to </w:t>
+      </w:r>
+      <w:r>
+        <w:t xml:space="preserve">be displayed on </w:t>
+      </w:r>
+      <w:r>
+        <w:t xml:space="preserve">the client. In effect, it becomes a read-only system where the functions and data gathering all occur on the server preventing the client from having direct access to them. This architecture allows the client and server to both be protected from attacks from malicious users. </w:t>
+      </w:r>
+    </w:p>
+    <w:p>
+      <w:r>
+        <w:t>Some issues do come from utilising this architecture though</w:t>
+      </w:r>
+      <w:r>
+        <w:t>. Data gathered on the webpage is still accessible to client, meaning data still needs to be protected and only gathered when necessary. Another difficul</w:t>
+      </w:r>
+      <w:r>
+        <w:t>t</w:t>
       </w:r>
       <w:r>
         <w:t>y</w:t>
       </w:r>
       <w:r>
-        <w:t xml:space="preserve"> importing the library a</w:t>
-      </w:r>
-      <w:r>
-        <w:t xml:space="preserve">t </w:t>
-      </w:r>
-      <w:r>
-        <w:t>runtime though pythons importlib library</w:t>
+        <w:t xml:space="preserve"> when using SSR is</w:t>
+      </w:r>
+      <w:r>
+        <w:t xml:space="preserve"> client interaction</w:t>
+      </w:r>
+      <w:r>
+        <w:t>s</w:t>
+      </w:r>
+      <w:r>
+        <w:t xml:space="preserve"> such as submitting forms or data </w:t>
+      </w:r>
+      <w:r>
+        <w:t>from</w:t>
+      </w:r>
+      <w:r>
+        <w:t xml:space="preserve"> the front end to the backend</w:t>
+      </w:r>
+      <w:r>
+        <w:t>. To get around</w:t>
+      </w:r>
+      <w:r>
+        <w:t xml:space="preserve"> this, Svelte uses a system called server actions.</w:t>
+      </w:r>
+      <w:r>
+        <w:t xml:space="preserve"> </w:t>
+      </w:r>
+      <w:r>
+        <w:t>Server actions are exported functions</w:t>
+      </w:r>
+      <w:r>
+        <w:t xml:space="preserve"> which the</w:t>
+      </w:r>
+      <w:r>
+        <w:t xml:space="preserve"> client has access to</w:t>
+      </w:r>
+      <w:r>
+        <w:t xml:space="preserve">, </w:t>
+      </w:r>
+      <w:r>
+        <w:t>which</w:t>
+      </w:r>
+      <w:r>
+        <w:t xml:space="preserve"> allow the front-end to interact with the server.</w:t>
+      </w:r>
+      <w:r>
+        <w:t xml:space="preserve"> </w:t>
+      </w:r>
+      <w:r>
+        <w:t xml:space="preserve">These functions aren’t directly accessible from the front-end but instead are submitted similarly to an http endpoint through forms or fetch requests. </w:t>
+      </w:r>
+      <w:r>
+        <w:t xml:space="preserve"> </w:t>
+      </w:r>
+    </w:p>
+    <w:p>
+      <w:r>
+        <w:t>(show some examples here)</w:t>
+      </w:r>
+    </w:p>
+    <w:p>
+      <w:r>
+        <w:t>When submitting a form, all form data is included within the request.</w:t>
+      </w:r>
+    </w:p>
+    <w:p/>
+    <w:p>
+      <w:r>
+        <w:t>Python</w:t>
+      </w:r>
+    </w:p>
+    <w:p>
+      <w:r>
+        <w:t>Python was the chosen language for the development of this project because of previous knowledge of the language, ease of development and the community support.</w:t>
+      </w:r>
+    </w:p>
+    <w:p>
+      <w:r>
+        <w:t xml:space="preserve">Community support was especially important for the project as the project was designed around also having </w:t>
+      </w:r>
+      <w:r>
+        <w:t>the community</w:t>
+      </w:r>
+      <w:r>
+        <w:t xml:space="preserve"> develop</w:t>
+      </w:r>
+      <w:r>
+        <w:t xml:space="preserve"> extensions</w:t>
+      </w:r>
+      <w:r>
+        <w:t xml:space="preserve"> for the application. Using a well</w:t>
+      </w:r>
+      <w:r>
+        <w:t>-</w:t>
+      </w:r>
+      <w:r>
+        <w:t>known and well supported language allows more people that would other not be able to contribute to be given the chance to</w:t>
+      </w:r>
+      <w:r>
+        <w:t>, a</w:t>
+      </w:r>
+      <w:r>
+        <w:t>s well being able to utilise different libraries and packages</w:t>
+      </w:r>
+      <w:r>
+        <w:t xml:space="preserve"> to simplify the development without having re-invent the wheel</w:t>
       </w:r>
       <w:r>
         <w:t>.</w:t>
       </w:r>
-      <w:r>
-        <w:t xml:space="preserve"> This uses the json file found in the settings folder to determine what to import and where it can be found.</w:t>
+    </w:p>
+    <w:p>
+      <w:r>
+        <w:t xml:space="preserve">Python is an incredibly versatile language. </w:t>
+      </w:r>
+      <w:r>
+        <w:t>A part of this versatility stems from the fact it is an interpreted language versus being a compiled language.</w:t>
+      </w:r>
+      <w:r>
+        <w:t xml:space="preserve"> Being interpreted means the code is run without first being compiled, this means the code is run line by line executing each command as it comes.</w:t>
+      </w:r>
+      <w:r>
+        <w:t xml:space="preserve"> This massively affects the development experience as skipping the compilation step allows for much faster development</w:t>
+      </w:r>
+      <w:r>
+        <w:t>,</w:t>
       </w:r>
       <w:r>
         <w:t xml:space="preserve"> </w:t>
       </w:r>
       <w:r>
-        <w:t>By doing it this way</w:t>
-      </w:r>
-      <w:r>
-        <w:t xml:space="preserve"> it simplifies the usage as nothing other than an easily accessible json file needs to be changed. </w:t>
-      </w:r>
-    </w:p>
+        <w:t>t</w:t>
+      </w:r>
+      <w:r>
+        <w:t>his is</w:t>
+      </w:r>
+      <w:r>
+        <w:t xml:space="preserve"> also</w:t>
+      </w:r>
+      <w:r>
+        <w:t xml:space="preserve"> why it</w:t>
+      </w:r>
+      <w:r>
+        <w:t xml:space="preserve"> is</w:t>
+      </w:r>
+      <w:r>
+        <w:t xml:space="preserve"> often chosen for web-development</w:t>
+      </w:r>
+      <w:r>
+        <w:t xml:space="preserve"> where hot-reloading and quick iteration is far more common</w:t>
+      </w:r>
+      <w:r>
+        <w:t>.</w:t>
+      </w:r>
+    </w:p>
+    <w:p>
+      <w:r>
+        <w:t>A downside to being interpreted is speed. Python is not widely regarded as being the most efficient or fast language out there</w:t>
+      </w:r>
+      <w:r>
+        <w:t xml:space="preserve">, it misses things such as compile-time optimisations and has </w:t>
+      </w:r>
+      <w:r>
+        <w:lastRenderedPageBreak/>
+        <w:t>a large amount of overhead in comparison to language such as C/C++ or Java</w:t>
+      </w:r>
+      <w:r>
+        <w:t>/C#</w:t>
+      </w:r>
+      <w:r>
+        <w:t>. To</w:t>
+      </w:r>
+      <w:r>
+        <w:t xml:space="preserve"> attempt to</w:t>
+      </w:r>
+      <w:r>
+        <w:t xml:space="preserve"> combat this, python utilises compiled C libraries to replace</w:t>
+      </w:r>
+      <w:r>
+        <w:t xml:space="preserve"> some of</w:t>
+      </w:r>
+      <w:r>
+        <w:t xml:space="preserve"> the slowest parts</w:t>
+      </w:r>
+      <w:r>
+        <w:t xml:space="preserve">, while also using a caching system to compile some parts of the application to python byte code which is much closer to native code than </w:t>
+      </w:r>
+      <w:r>
+        <w:t xml:space="preserve">running </w:t>
+      </w:r>
+      <w:r>
+        <w:t xml:space="preserve">the </w:t>
+      </w:r>
+      <w:r>
+        <w:t>interpreted code.</w:t>
+      </w:r>
+    </w:p>
+    <w:p>
+      <w:r>
+        <w:t>Modern versions of python include the keywords for async await execution.</w:t>
+      </w:r>
+      <w:r>
+        <w:t xml:space="preserve"> </w:t>
+      </w:r>
+      <w:r>
+        <w:t xml:space="preserve">Async </w:t>
+      </w:r>
+      <w:r>
+        <w:t xml:space="preserve">architecture </w:t>
+      </w:r>
+      <w:r>
+        <w:t>allows for the</w:t>
+      </w:r>
+      <w:r>
+        <w:t xml:space="preserve"> concurrent execution of code</w:t>
+      </w:r>
+      <w:r>
+        <w:t>, meaning, instead of having to wait for code to execute other code can instead be executed and processed while waiting</w:t>
+      </w:r>
+      <w:r>
+        <w:t>.</w:t>
+      </w:r>
+      <w:r>
+        <w:t xml:space="preserve"> All server functions in the ICMS server a</w:t>
+      </w:r>
+      <w:r>
+        <w:t>re</w:t>
+      </w:r>
+      <w:r>
+        <w:t xml:space="preserve"> built using the async architecture because</w:t>
+      </w:r>
+      <w:r>
+        <w:t xml:space="preserve"> extensions </w:t>
+      </w:r>
+      <w:r>
+        <w:t>are designed to be able</w:t>
+      </w:r>
+      <w:r>
+        <w:t xml:space="preserve"> to run in the background depending on what needs to be processed</w:t>
+      </w:r>
+      <w:r>
+        <w:t>,</w:t>
+      </w:r>
+      <w:r>
+        <w:t xml:space="preserve"> through the asyncio</w:t>
+      </w:r>
+      <w:r>
+        <w:t xml:space="preserve"> python</w:t>
+      </w:r>
+      <w:r>
+        <w:t xml:space="preserve"> library.</w:t>
+      </w:r>
+      <w:r>
+        <w:t xml:space="preserve"> This design also helps when utilising </w:t>
+      </w:r>
+      <w:r>
+        <w:t>different</w:t>
+      </w:r>
+      <w:r>
+        <w:t xml:space="preserve"> threads for things such as, writing</w:t>
+      </w:r>
+      <w:r>
+        <w:t xml:space="preserve"> or reading to or from</w:t>
+      </w:r>
+      <w:r>
+        <w:t xml:space="preserve"> a device </w:t>
+      </w:r>
+      <w:r>
+        <w:t>multiple time</w:t>
+      </w:r>
+      <w:r>
+        <w:t xml:space="preserve"> a second</w:t>
+      </w:r>
+      <w:r>
+        <w:t>.</w:t>
+      </w:r>
+    </w:p>
+    <w:p/>
+    <w:p>
+      <w:r>
+        <w:t xml:space="preserve">Python </w:t>
+      </w:r>
+      <w:r>
+        <w:t>GIL</w:t>
+      </w:r>
+    </w:p>
+    <w:p>
+      <w:r>
+        <w:t>The python GIL protects from cross-thread errors</w:t>
+      </w:r>
+      <w:r>
+        <w:t xml:space="preserve"> such as race conditions</w:t>
+      </w:r>
+      <w:r>
+        <w:t xml:space="preserve"> by detecting when the application attempts to access </w:t>
+      </w:r>
+      <w:r>
+        <w:t>objects unsafely</w:t>
+      </w:r>
+      <w:r>
+        <w:t>.</w:t>
+      </w:r>
+      <w:r>
+        <w:t xml:space="preserve"> Many languages leave this up to the developer to protect against, most notably C/C++</w:t>
+      </w:r>
+      <w:r>
+        <w:t xml:space="preserve"> has no protection against thread unsafe code</w:t>
+      </w:r>
+      <w:r>
+        <w:t xml:space="preserve"> and as a result many errors can stem from attempting to write multithreaded code</w:t>
+      </w:r>
+      <w:r>
+        <w:t>.</w:t>
+      </w:r>
+      <w:r>
+        <w:t xml:space="preserve"> Through the GIL python instead </w:t>
+      </w:r>
+      <w:r>
+        <w:t>does this automatically.</w:t>
+      </w:r>
+    </w:p>
+    <w:p/>
+    <w:p>
+      <w:r>
+        <w:t xml:space="preserve">Extending </w:t>
+      </w:r>
+      <w:r>
+        <w:t>the</w:t>
+      </w:r>
+      <w:r>
+        <w:t xml:space="preserve"> application</w:t>
+      </w:r>
+    </w:p>
+    <w:p>
+      <w:r>
+        <w:t>The system for loading extensions in the ICMS server utilises the fact that python has easy access to a global</w:t>
+      </w:r>
+      <w:r>
+        <w:t xml:space="preserve"> system where the libraries and stored and displayed. Having access to this s</w:t>
+      </w:r>
+      <w:r>
+        <w:t>ystem</w:t>
+      </w:r>
+      <w:r>
+        <w:t xml:space="preserve"> means libraries can be imported and unimported at will. It also means that individual libraries can be used similarly to objects where the library object can be stored and referenced.</w:t>
+      </w:r>
+    </w:p>
+    <w:p>
+      <w:r>
+        <w:t>In the application</w:t>
+      </w:r>
+      <w:r>
+        <w:t xml:space="preserve"> </w:t>
+      </w:r>
+      <w:r>
+        <w:t>extensions are loaded before any of the other parts of the software are started</w:t>
+      </w:r>
+      <w:r>
+        <w:t xml:space="preserve"> through the init_extensions function found in the webserver</w:t>
+      </w:r>
+      <w:r>
+        <w:t>. The</w:t>
+      </w:r>
+      <w:r>
+        <w:t xml:space="preserve">se extensions </w:t>
+      </w:r>
+      <w:r>
+        <w:t>are loaded by importing</w:t>
+      </w:r>
+      <w:r>
+        <w:t xml:space="preserve"> it</w:t>
+      </w:r>
+      <w:r>
+        <w:t xml:space="preserve"> at runtime though pythons importlib library.</w:t>
+      </w:r>
+      <w:r>
+        <w:t xml:space="preserve"> This way of loading the </w:t>
+      </w:r>
+      <w:r>
+        <w:t xml:space="preserve">extensions </w:t>
+      </w:r>
+      <w:r>
+        <w:t xml:space="preserve">allows the end user to </w:t>
+      </w:r>
+      <w:r>
+        <w:t>decide</w:t>
+      </w:r>
+      <w:r>
+        <w:t xml:space="preserve"> which libraries </w:t>
+      </w:r>
+      <w:r>
+        <w:t xml:space="preserve">need </w:t>
+      </w:r>
+      <w:r>
+        <w:t xml:space="preserve">to be imported and where from </w:t>
+      </w:r>
+      <w:r>
+        <w:t>us</w:t>
+      </w:r>
+      <w:r>
+        <w:t>ing</w:t>
+      </w:r>
+      <w:r>
+        <w:t xml:space="preserve"> the json file found in the settings </w:t>
+      </w:r>
+      <w:r>
+        <w:t>folder</w:t>
+      </w:r>
+      <w:r>
+        <w:t>. This massively simplifies the end user experience for building and using community made extensions.</w:t>
+      </w:r>
+      <w:r>
+        <w:t xml:space="preserve"> </w:t>
+      </w:r>
+    </w:p>
+    <w:p>
+      <w:r>
+        <w:t xml:space="preserve">This system also massively benefits developers as the core systems can continue to run after importing an extension </w:t>
+      </w:r>
+      <w:r>
+        <w:t xml:space="preserve">even </w:t>
+      </w:r>
+      <w:r>
+        <w:t>with broken code as the</w:t>
+      </w:r>
+      <w:r>
+        <w:t xml:space="preserve"> extension will just fail to be imported through the try-catch statement.</w:t>
+      </w:r>
+      <w:r>
+        <w:t xml:space="preserve"> This failure to be imported will also display a debugging message in the log file making tracking down errors significantly easier.</w:t>
+      </w:r>
+      <w:r>
+        <w:t xml:space="preserve">  </w:t>
+      </w:r>
+      <w:r>
+        <w:t xml:space="preserve"> </w:t>
+      </w:r>
+    </w:p>
+    <w:p/>
+    <w:p/>
+    <w:p/>
+    <w:p/>
+    <w:p/>
+    <w:p/>
     <w:p/>
     <w:p/>
     <w:p>
@@ -481,49 +956,194 @@
         <w:t>Sockets and web-sockets</w:t>
       </w:r>
     </w:p>
-    <w:p/>
-    <w:p>
-      <w:r>
-        <w:t>Python</w:t>
-      </w:r>
-    </w:p>
-    <w:p/>
-    <w:p>
-      <w:r>
-        <w:t>Async await background</w:t>
-      </w:r>
-    </w:p>
-    <w:p>
-      <w:r>
-        <w:t xml:space="preserve">The </w:t>
-      </w:r>
-      <w:r>
-        <w:t>Async design</w:t>
-      </w:r>
-      <w:r>
-        <w:t xml:space="preserve"> of the application allows for the extensions of the application to run in the background depending on what needs to be processed.</w:t>
-      </w:r>
-    </w:p>
-    <w:p/>
-    <w:p>
-      <w:r>
-        <w:t xml:space="preserve">Python </w:t>
-      </w:r>
-      <w:r>
-        <w:t>GIL</w:t>
-      </w:r>
-    </w:p>
-    <w:p>
-      <w:r>
-        <w:t>Thread safe and non-thread safe</w:t>
-      </w:r>
-    </w:p>
-    <w:p/>
-    <w:p>
-      <w:r>
-        <w:t>Extending an application</w:t>
-      </w:r>
-    </w:p>
+    <w:p>
+      <w:r>
+        <w:t>The ICMS application is comprised of two different servers, a flask http server and a socket server.</w:t>
+      </w:r>
+      <w:r>
+        <w:t xml:space="preserve"> The key differences between these two servers </w:t>
+      </w:r>
+      <w:r>
+        <w:t>are</w:t>
+      </w:r>
+      <w:r>
+        <w:t xml:space="preserve"> the </w:t>
+      </w:r>
+      <w:r>
+        <w:t>HTTP</w:t>
+      </w:r>
+      <w:r>
+        <w:t xml:space="preserve"> server uses the REST architecture for receiving HTTP requests, where each request can</w:t>
+      </w:r>
+      <w:r>
+        <w:t xml:space="preserve"> only</w:t>
+      </w:r>
+      <w:r>
+        <w:t xml:space="preserve"> be one type of</w:t>
+      </w:r>
+      <w:r>
+        <w:t xml:space="preserve"> HTTP</w:t>
+      </w:r>
+      <w:r>
+        <w:t xml:space="preserve"> request</w:t>
+      </w:r>
+      <w:r>
+        <w:t>, for example, a GET or POST</w:t>
+      </w:r>
+      <w:r>
+        <w:t xml:space="preserve"> request</w:t>
+      </w:r>
+      <w:r>
+        <w:t xml:space="preserve">. </w:t>
+      </w:r>
+      <w:r>
+        <w:t>The issue with a HTTP server is that data can only be transferred when a request is made, meaning streaming data between the server and device can only occur if the device either makes many requests to the server, or similarly, the server makes many requests to the device. If the latter was chosen, the device would also need to be running its own server also in</w:t>
+      </w:r>
+      <w:r>
+        <w:t>troducing</w:t>
+      </w:r>
+      <w:r>
+        <w:t xml:space="preserve"> a</w:t>
+      </w:r>
+      <w:r>
+        <w:t xml:space="preserve"> </w:t>
+      </w:r>
+      <w:r>
+        <w:t>performance over-head</w:t>
+      </w:r>
+      <w:r>
+        <w:t xml:space="preserve"> which only much lower power devices needs to be avoided at all costs</w:t>
+      </w:r>
+      <w:r>
+        <w:t>.</w:t>
+      </w:r>
+    </w:p>
+    <w:p>
+      <w:r>
+        <w:t xml:space="preserve">Instead, </w:t>
+      </w:r>
+      <w:r>
+        <w:t>t</w:t>
+      </w:r>
+      <w:r>
+        <w:t>he socket server is</w:t>
+      </w:r>
+      <w:r>
+        <w:t xml:space="preserve"> the server</w:t>
+      </w:r>
+      <w:r>
+        <w:t xml:space="preserve"> used to communicate with the iot-devices</w:t>
+      </w:r>
+      <w:r>
+        <w:t>.</w:t>
+      </w:r>
+      <w:r>
+        <w:t xml:space="preserve"> A socket server instead reads from a stream of data, where data can be sent and </w:t>
+      </w:r>
+      <w:r>
+        <w:t>received</w:t>
+      </w:r>
+      <w:r>
+        <w:t xml:space="preserve"> at </w:t>
+      </w:r>
+      <w:r>
+        <w:t>any time</w:t>
+      </w:r>
+      <w:r>
+        <w:t xml:space="preserve"> from either side.</w:t>
+      </w:r>
+      <w:r>
+        <w:t xml:space="preserve"> This massively reduces the over-head necessary as instead of having to make many requests, the device can instead simply create and keep open one connection to the main server that can be reused to send and receive</w:t>
+      </w:r>
+      <w:r>
+        <w:t>.</w:t>
+      </w:r>
+    </w:p>
+    <w:p>
+      <w:r>
+        <w:t>Using the socket server does come with some caveats</w:t>
+      </w:r>
+      <w:r>
+        <w:t>. Mainly being the unstructured form of data being sent.</w:t>
+      </w:r>
+      <w:r>
+        <w:t xml:space="preserve"> In comparison to the pre-formed HTTP requests which can be easily</w:t>
+      </w:r>
+      <w:r>
+        <w:t xml:space="preserve"> read and manipulated</w:t>
+      </w:r>
+      <w:r>
+        <w:t>, t</w:t>
+      </w:r>
+      <w:r>
+        <w:t>he socket server and clients send raw bytes of data between each-other which need to be decoded and formed into readable data.</w:t>
+      </w:r>
+      <w:r>
+        <w:t xml:space="preserve"> JSON </w:t>
+      </w:r>
+      <w:r>
+        <w:t>was</w:t>
+      </w:r>
+      <w:r>
+        <w:t xml:space="preserve"> the form of data chosen to be </w:t>
+      </w:r>
+      <w:r>
+        <w:t>used by the server and clients as it is</w:t>
+      </w:r>
+      <w:r>
+        <w:t xml:space="preserve"> an</w:t>
+      </w:r>
+      <w:r>
+        <w:t xml:space="preserve"> incredibly versatile</w:t>
+      </w:r>
+      <w:r>
+        <w:t xml:space="preserve"> data format</w:t>
+      </w:r>
+      <w:r>
+        <w:t xml:space="preserve"> widely supported by languages and different libraries and systems</w:t>
+      </w:r>
+      <w:r>
+        <w:t>, while also being incredibly human read and writable</w:t>
+      </w:r>
+      <w:r>
+        <w:t>.</w:t>
+      </w:r>
+      <w:r>
+        <w:t xml:space="preserve"> Python especially has amazing built in support for the JSON format</w:t>
+      </w:r>
+      <w:r>
+        <w:t>.</w:t>
+      </w:r>
+    </w:p>
+    <w:p>
+      <w:r>
+        <w:t>The socket server captures the sent data</w:t>
+      </w:r>
+      <w:r>
+        <w:t xml:space="preserve"> from the client</w:t>
+      </w:r>
+      <w:r>
+        <w:t xml:space="preserve"> and determines how the command needs to be interpreted</w:t>
+      </w:r>
+      <w:r>
+        <w:t>.</w:t>
+      </w:r>
+    </w:p>
+    <w:p>
+      <w:r>
+        <w:t>IOT server functions</w:t>
+      </w:r>
+    </w:p>
+    <w:p/>
+    <w:p/>
+    <w:p/>
+    <w:p/>
+    <w:p/>
+    <w:p/>
+    <w:p/>
+    <w:p/>
+    <w:p/>
+    <w:p/>
     <w:p/>
     <w:p>
       <w:r>
@@ -557,9 +1177,22 @@
       </w:r>
     </w:p>
     <w:p/>
-    <w:p>
-      <w:r>
-        <w:lastRenderedPageBreak/>
+    <w:p/>
+    <w:p/>
+    <w:p/>
+    <w:p/>
+    <w:p/>
+    <w:p/>
+    <w:p/>
+    <w:p/>
+    <w:p/>
+    <w:p/>
+    <w:p/>
+    <w:p/>
+    <w:p/>
+    <w:p/>
+    <w:p>
+      <w:r>
         <w:t xml:space="preserve">Ease of development vs </w:t>
       </w:r>
       <w:r>
@@ -587,11 +1220,19 @@
         <w:t>Centralised file hosting</w:t>
       </w:r>
     </w:p>
+    <w:p/>
     <w:p>
       <w:r>
         <w:t>Authentication</w:t>
       </w:r>
     </w:p>
+    <w:p>
+      <w:r>
+        <w:t>Authentication is simple for the application.</w:t>
+      </w:r>
+    </w:p>
+    <w:p/>
+    <w:p/>
     <w:p/>
     <w:p>
       <w:r>
@@ -622,6 +1263,25 @@
     <w:p/>
     <w:p/>
     <w:p/>
+    <w:p/>
+    <w:p/>
+    <w:p/>
+    <w:p/>
+    <w:p/>
+    <w:p/>
+    <w:p/>
+    <w:p/>
+    <w:p/>
+    <w:p/>
+    <w:p/>
+    <w:p/>
+    <w:p/>
+    <w:p/>
+    <w:p/>
+    <w:p/>
+    <w:p/>
+    <w:p/>
+    <w:p/>
     <w:p>
       <w:r>
         <w:t>Docker</w:t>
@@ -629,6 +1289,25 @@
     </w:p>
     <w:p>
       <w:r>
+        <w:t xml:space="preserve">Docker is an application built to containerise other applications. Through this containerisation, developers can build and test their code </w:t>
+      </w:r>
+      <w:r>
+        <w:t xml:space="preserve">without having to worry about </w:t>
+      </w:r>
+    </w:p>
+    <w:p>
+      <w:r>
+        <w:t>Docker was chosen to simplify the build process for both applications.</w:t>
+      </w:r>
+      <w:r>
+        <w:t xml:space="preserve"> </w:t>
+      </w:r>
+      <w:r>
+        <w:t>Docker allows the developer to automate the build process by using step-by-step commands in a file called a Dockerfile.</w:t>
+      </w:r>
+    </w:p>
+    <w:p>
+      <w:r>
         <w:t>Docker</w:t>
       </w:r>
       <w:r>
@@ -641,18 +1320,34 @@
         <w:t>ompose</w:t>
       </w:r>
     </w:p>
-    <w:p/>
-    <w:p/>
+    <w:p>
+      <w:r>
+        <w:lastRenderedPageBreak/>
+        <w:t>Docker compose allows</w:t>
+      </w:r>
+      <w:r>
+        <w:t xml:space="preserve"> Dockerfiles to be compiled together and run simultaneously in the same docker image. Through the image, different applications can be disabled and enabled depending on which parts the end user wishes to use. </w:t>
+      </w:r>
+    </w:p>
+    <w:p/>
+    <w:p>
+      <w:r>
+        <w:t>Nginx</w:t>
+      </w:r>
+    </w:p>
+    <w:p>
+      <w:r>
+        <w:t>Nginx through docker</w:t>
+      </w:r>
+    </w:p>
     <w:p>
       <w:r>
         <w:t>Reverse proxies</w:t>
       </w:r>
     </w:p>
-    <w:p>
-      <w:r>
-        <w:t>Nginx</w:t>
-      </w:r>
-    </w:p>
+    <w:p/>
+    <w:p/>
+    <w:p/>
     <w:p/>
     <w:p>
       <w:r>
@@ -662,6 +1357,18 @@
         <w:t>ease of use</w:t>
       </w:r>
     </w:p>
+    <w:p/>
+    <w:p/>
+    <w:p/>
+    <w:p/>
+    <w:p/>
+    <w:p/>
+    <w:p/>
+    <w:p/>
+    <w:p/>
+    <w:p/>
+    <w:p/>
+    <w:p/>
     <w:p/>
     <w:p/>
     <w:p>

</xml_diff>

<commit_message>
fixed database on first start, updated docs
</commit_message>
<xml_diff>
--- a/docs/report.docx
+++ b/docs/report.docx
@@ -58,7 +58,7 @@
           <w:r>
             <w:fldChar w:fldCharType="separate"/>
           </w:r>
-          <w:hyperlink w:anchor="_Toc196607708" w:history="1">
+          <w:hyperlink w:anchor="_Toc196608726" w:history="1">
             <w:r>
               <w:rPr>
                 <w:rStyle w:val="Hyperlink"/>
@@ -85,7 +85,7 @@
                 <w:noProof/>
                 <w:webHidden/>
               </w:rPr>
-              <w:instrText xml:space="preserve"> PAGEREF _Toc196607708 \h </w:instrText>
+              <w:instrText xml:space="preserve"> PAGEREF _Toc196608726 \h </w:instrText>
             </w:r>
             <w:r>
               <w:rPr>
@@ -130,7 +130,7 @@
               <w:lang w:eastAsia="en-GB"/>
             </w:rPr>
           </w:pPr>
-          <w:hyperlink w:anchor="_Toc196607709" w:history="1">
+          <w:hyperlink w:anchor="_Toc196608727" w:history="1">
             <w:r>
               <w:rPr>
                 <w:rStyle w:val="Hyperlink"/>
@@ -157,7 +157,7 @@
                 <w:noProof/>
                 <w:webHidden/>
               </w:rPr>
-              <w:instrText xml:space="preserve"> PAGEREF _Toc196607709 \h </w:instrText>
+              <w:instrText xml:space="preserve"> PAGEREF _Toc196608727 \h </w:instrText>
             </w:r>
             <w:r>
               <w:rPr>
@@ -202,7 +202,7 @@
               <w:lang w:eastAsia="en-GB"/>
             </w:rPr>
           </w:pPr>
-          <w:hyperlink w:anchor="_Toc196607710" w:history="1">
+          <w:hyperlink w:anchor="_Toc196608728" w:history="1">
             <w:r>
               <w:rPr>
                 <w:rStyle w:val="Hyperlink"/>
@@ -229,7 +229,7 @@
                 <w:noProof/>
                 <w:webHidden/>
               </w:rPr>
-              <w:instrText xml:space="preserve"> PAGEREF _Toc196607710 \h </w:instrText>
+              <w:instrText xml:space="preserve"> PAGEREF _Toc196608728 \h </w:instrText>
             </w:r>
             <w:r>
               <w:rPr>
@@ -274,7 +274,7 @@
               <w:lang w:eastAsia="en-GB"/>
             </w:rPr>
           </w:pPr>
-          <w:hyperlink w:anchor="_Toc196607711" w:history="1">
+          <w:hyperlink w:anchor="_Toc196608729" w:history="1">
             <w:r>
               <w:rPr>
                 <w:rStyle w:val="Hyperlink"/>
@@ -301,7 +301,7 @@
                 <w:noProof/>
                 <w:webHidden/>
               </w:rPr>
-              <w:instrText xml:space="preserve"> PAGEREF _Toc196607711 \h </w:instrText>
+              <w:instrText xml:space="preserve"> PAGEREF _Toc196608729 \h </w:instrText>
             </w:r>
             <w:r>
               <w:rPr>
@@ -346,7 +346,7 @@
               <w:lang w:eastAsia="en-GB"/>
             </w:rPr>
           </w:pPr>
-          <w:hyperlink w:anchor="_Toc196607712" w:history="1">
+          <w:hyperlink w:anchor="_Toc196608730" w:history="1">
             <w:r>
               <w:rPr>
                 <w:rStyle w:val="Hyperlink"/>
@@ -373,7 +373,7 @@
                 <w:noProof/>
                 <w:webHidden/>
               </w:rPr>
-              <w:instrText xml:space="preserve"> PAGEREF _Toc196607712 \h </w:instrText>
+              <w:instrText xml:space="preserve"> PAGEREF _Toc196608730 \h </w:instrText>
             </w:r>
             <w:r>
               <w:rPr>
@@ -418,7 +418,7 @@
               <w:lang w:eastAsia="en-GB"/>
             </w:rPr>
           </w:pPr>
-          <w:hyperlink w:anchor="_Toc196607713" w:history="1">
+          <w:hyperlink w:anchor="_Toc196608731" w:history="1">
             <w:r>
               <w:rPr>
                 <w:rStyle w:val="Hyperlink"/>
@@ -445,7 +445,7 @@
                 <w:noProof/>
                 <w:webHidden/>
               </w:rPr>
-              <w:instrText xml:space="preserve"> PAGEREF _Toc196607713 \h </w:instrText>
+              <w:instrText xml:space="preserve"> PAGEREF _Toc196608731 \h </w:instrText>
             </w:r>
             <w:r>
               <w:rPr>
@@ -490,7 +490,7 @@
               <w:lang w:eastAsia="en-GB"/>
             </w:rPr>
           </w:pPr>
-          <w:hyperlink w:anchor="_Toc196607714" w:history="1">
+          <w:hyperlink w:anchor="_Toc196608732" w:history="1">
             <w:r>
               <w:rPr>
                 <w:rStyle w:val="Hyperlink"/>
@@ -517,7 +517,7 @@
                 <w:noProof/>
                 <w:webHidden/>
               </w:rPr>
-              <w:instrText xml:space="preserve"> PAGEREF _Toc196607714 \h </w:instrText>
+              <w:instrText xml:space="preserve"> PAGEREF _Toc196608732 \h </w:instrText>
             </w:r>
             <w:r>
               <w:rPr>
@@ -562,7 +562,7 @@
               <w:lang w:eastAsia="en-GB"/>
             </w:rPr>
           </w:pPr>
-          <w:hyperlink w:anchor="_Toc196607715" w:history="1">
+          <w:hyperlink w:anchor="_Toc196608733" w:history="1">
             <w:r>
               <w:rPr>
                 <w:rStyle w:val="Hyperlink"/>
@@ -589,7 +589,7 @@
                 <w:noProof/>
                 <w:webHidden/>
               </w:rPr>
-              <w:instrText xml:space="preserve"> PAGEREF _Toc196607715 \h </w:instrText>
+              <w:instrText xml:space="preserve"> PAGEREF _Toc196608733 \h </w:instrText>
             </w:r>
             <w:r>
               <w:rPr>
@@ -634,7 +634,7 @@
               <w:lang w:eastAsia="en-GB"/>
             </w:rPr>
           </w:pPr>
-          <w:hyperlink w:anchor="_Toc196607716" w:history="1">
+          <w:hyperlink w:anchor="_Toc196608734" w:history="1">
             <w:r>
               <w:rPr>
                 <w:rStyle w:val="Hyperlink"/>
@@ -661,7 +661,7 @@
                 <w:noProof/>
                 <w:webHidden/>
               </w:rPr>
-              <w:instrText xml:space="preserve"> PAGEREF _Toc196607716 \h </w:instrText>
+              <w:instrText xml:space="preserve"> PAGEREF _Toc196608734 \h </w:instrText>
             </w:r>
             <w:r>
               <w:rPr>
@@ -706,7 +706,7 @@
               <w:lang w:eastAsia="en-GB"/>
             </w:rPr>
           </w:pPr>
-          <w:hyperlink w:anchor="_Toc196607717" w:history="1">
+          <w:hyperlink w:anchor="_Toc196608735" w:history="1">
             <w:r>
               <w:rPr>
                 <w:rStyle w:val="Hyperlink"/>
@@ -733,7 +733,7 @@
                 <w:noProof/>
                 <w:webHidden/>
               </w:rPr>
-              <w:instrText xml:space="preserve"> PAGEREF _Toc196607717 \h </w:instrText>
+              <w:instrText xml:space="preserve"> PAGEREF _Toc196608735 \h </w:instrText>
             </w:r>
             <w:r>
               <w:rPr>
@@ -778,7 +778,7 @@
               <w:lang w:eastAsia="en-GB"/>
             </w:rPr>
           </w:pPr>
-          <w:hyperlink w:anchor="_Toc196607718" w:history="1">
+          <w:hyperlink w:anchor="_Toc196608736" w:history="1">
             <w:r>
               <w:rPr>
                 <w:rStyle w:val="Hyperlink"/>
@@ -805,7 +805,7 @@
                 <w:noProof/>
                 <w:webHidden/>
               </w:rPr>
-              <w:instrText xml:space="preserve"> PAGEREF _Toc196607718 \h </w:instrText>
+              <w:instrText xml:space="preserve"> PAGEREF _Toc196608736 \h </w:instrText>
             </w:r>
             <w:r>
               <w:rPr>
@@ -850,7 +850,7 @@
               <w:lang w:eastAsia="en-GB"/>
             </w:rPr>
           </w:pPr>
-          <w:hyperlink w:anchor="_Toc196607719" w:history="1">
+          <w:hyperlink w:anchor="_Toc196608737" w:history="1">
             <w:r>
               <w:rPr>
                 <w:rStyle w:val="Hyperlink"/>
@@ -877,7 +877,7 @@
                 <w:noProof/>
                 <w:webHidden/>
               </w:rPr>
-              <w:instrText xml:space="preserve"> PAGEREF _Toc196607719 \h </w:instrText>
+              <w:instrText xml:space="preserve"> PAGEREF _Toc196608737 \h </w:instrText>
             </w:r>
             <w:r>
               <w:rPr>
@@ -897,7 +897,7 @@
                 <w:noProof/>
                 <w:webHidden/>
               </w:rPr>
-              <w:t>6</w:t>
+              <w:t>5</w:t>
             </w:r>
             <w:r>
               <w:rPr>
@@ -922,7 +922,7 @@
               <w:lang w:eastAsia="en-GB"/>
             </w:rPr>
           </w:pPr>
-          <w:hyperlink w:anchor="_Toc196607720" w:history="1">
+          <w:hyperlink w:anchor="_Toc196608738" w:history="1">
             <w:r>
               <w:rPr>
                 <w:rStyle w:val="Hyperlink"/>
@@ -949,7 +949,7 @@
                 <w:noProof/>
                 <w:webHidden/>
               </w:rPr>
-              <w:instrText xml:space="preserve"> PAGEREF _Toc196607720 \h </w:instrText>
+              <w:instrText xml:space="preserve"> PAGEREF _Toc196608738 \h </w:instrText>
             </w:r>
             <w:r>
               <w:rPr>
@@ -969,7 +969,7 @@
                 <w:noProof/>
                 <w:webHidden/>
               </w:rPr>
-              <w:t>6</w:t>
+              <w:t>5</w:t>
             </w:r>
             <w:r>
               <w:rPr>
@@ -994,7 +994,7 @@
               <w:lang w:eastAsia="en-GB"/>
             </w:rPr>
           </w:pPr>
-          <w:hyperlink w:anchor="_Toc196607721" w:history="1">
+          <w:hyperlink w:anchor="_Toc196608739" w:history="1">
             <w:r>
               <w:rPr>
                 <w:rStyle w:val="Hyperlink"/>
@@ -1021,7 +1021,7 @@
                 <w:noProof/>
                 <w:webHidden/>
               </w:rPr>
-              <w:instrText xml:space="preserve"> PAGEREF _Toc196607721 \h </w:instrText>
+              <w:instrText xml:space="preserve"> PAGEREF _Toc196608739 \h </w:instrText>
             </w:r>
             <w:r>
               <w:rPr>
@@ -1066,7 +1066,7 @@
               <w:lang w:eastAsia="en-GB"/>
             </w:rPr>
           </w:pPr>
-          <w:hyperlink w:anchor="_Toc196607722" w:history="1">
+          <w:hyperlink w:anchor="_Toc196608740" w:history="1">
             <w:r>
               <w:rPr>
                 <w:rStyle w:val="Hyperlink"/>
@@ -1093,7 +1093,7 @@
                 <w:noProof/>
                 <w:webHidden/>
               </w:rPr>
-              <w:instrText xml:space="preserve"> PAGEREF _Toc196607722 \h </w:instrText>
+              <w:instrText xml:space="preserve"> PAGEREF _Toc196608740 \h </w:instrText>
             </w:r>
             <w:r>
               <w:rPr>
@@ -1138,7 +1138,7 @@
               <w:lang w:eastAsia="en-GB"/>
             </w:rPr>
           </w:pPr>
-          <w:hyperlink w:anchor="_Toc196607723" w:history="1">
+          <w:hyperlink w:anchor="_Toc196608741" w:history="1">
             <w:r>
               <w:rPr>
                 <w:rStyle w:val="Hyperlink"/>
@@ -1165,7 +1165,7 @@
                 <w:noProof/>
                 <w:webHidden/>
               </w:rPr>
-              <w:instrText xml:space="preserve"> PAGEREF _Toc196607723 \h </w:instrText>
+              <w:instrText xml:space="preserve"> PAGEREF _Toc196608741 \h </w:instrText>
             </w:r>
             <w:r>
               <w:rPr>
@@ -1210,7 +1210,7 @@
               <w:lang w:eastAsia="en-GB"/>
             </w:rPr>
           </w:pPr>
-          <w:hyperlink w:anchor="_Toc196607724" w:history="1">
+          <w:hyperlink w:anchor="_Toc196608742" w:history="1">
             <w:r>
               <w:rPr>
                 <w:rStyle w:val="Hyperlink"/>
@@ -1237,7 +1237,7 @@
                 <w:noProof/>
                 <w:webHidden/>
               </w:rPr>
-              <w:instrText xml:space="preserve"> PAGEREF _Toc196607724 \h </w:instrText>
+              <w:instrText xml:space="preserve"> PAGEREF _Toc196608742 \h </w:instrText>
             </w:r>
             <w:r>
               <w:rPr>
@@ -1282,7 +1282,7 @@
               <w:lang w:eastAsia="en-GB"/>
             </w:rPr>
           </w:pPr>
-          <w:hyperlink w:anchor="_Toc196607725" w:history="1">
+          <w:hyperlink w:anchor="_Toc196608743" w:history="1">
             <w:r>
               <w:rPr>
                 <w:rStyle w:val="Hyperlink"/>
@@ -1309,7 +1309,7 @@
                 <w:noProof/>
                 <w:webHidden/>
               </w:rPr>
-              <w:instrText xml:space="preserve"> PAGEREF _Toc196607725 \h </w:instrText>
+              <w:instrText xml:space="preserve"> PAGEREF _Toc196608743 \h </w:instrText>
             </w:r>
             <w:r>
               <w:rPr>
@@ -1354,7 +1354,7 @@
               <w:lang w:eastAsia="en-GB"/>
             </w:rPr>
           </w:pPr>
-          <w:hyperlink w:anchor="_Toc196607726" w:history="1">
+          <w:hyperlink w:anchor="_Toc196608744" w:history="1">
             <w:r>
               <w:rPr>
                 <w:rStyle w:val="Hyperlink"/>
@@ -1381,7 +1381,7 @@
                 <w:noProof/>
                 <w:webHidden/>
               </w:rPr>
-              <w:instrText xml:space="preserve"> PAGEREF _Toc196607726 \h </w:instrText>
+              <w:instrText xml:space="preserve"> PAGEREF _Toc196608744 \h </w:instrText>
             </w:r>
             <w:r>
               <w:rPr>
@@ -1426,7 +1426,7 @@
               <w:lang w:eastAsia="en-GB"/>
             </w:rPr>
           </w:pPr>
-          <w:hyperlink w:anchor="_Toc196607727" w:history="1">
+          <w:hyperlink w:anchor="_Toc196608745" w:history="1">
             <w:r>
               <w:rPr>
                 <w:rStyle w:val="Hyperlink"/>
@@ -1453,7 +1453,7 @@
                 <w:noProof/>
                 <w:webHidden/>
               </w:rPr>
-              <w:instrText xml:space="preserve"> PAGEREF _Toc196607727 \h </w:instrText>
+              <w:instrText xml:space="preserve"> PAGEREF _Toc196608745 \h </w:instrText>
             </w:r>
             <w:r>
               <w:rPr>
@@ -1498,7 +1498,7 @@
               <w:lang w:eastAsia="en-GB"/>
             </w:rPr>
           </w:pPr>
-          <w:hyperlink w:anchor="_Toc196607728" w:history="1">
+          <w:hyperlink w:anchor="_Toc196608746" w:history="1">
             <w:r>
               <w:rPr>
                 <w:rStyle w:val="Hyperlink"/>
@@ -1525,7 +1525,7 @@
                 <w:noProof/>
                 <w:webHidden/>
               </w:rPr>
-              <w:instrText xml:space="preserve"> PAGEREF _Toc196607728 \h </w:instrText>
+              <w:instrText xml:space="preserve"> PAGEREF _Toc196608746 \h </w:instrText>
             </w:r>
             <w:r>
               <w:rPr>
@@ -1570,7 +1570,7 @@
               <w:lang w:eastAsia="en-GB"/>
             </w:rPr>
           </w:pPr>
-          <w:hyperlink w:anchor="_Toc196607729" w:history="1">
+          <w:hyperlink w:anchor="_Toc196608747" w:history="1">
             <w:r>
               <w:rPr>
                 <w:rStyle w:val="Hyperlink"/>
@@ -1597,7 +1597,7 @@
                 <w:noProof/>
                 <w:webHidden/>
               </w:rPr>
-              <w:instrText xml:space="preserve"> PAGEREF _Toc196607729 \h </w:instrText>
+              <w:instrText xml:space="preserve"> PAGEREF _Toc196608747 \h </w:instrText>
             </w:r>
             <w:r>
               <w:rPr>
@@ -1642,7 +1642,7 @@
               <w:lang w:eastAsia="en-GB"/>
             </w:rPr>
           </w:pPr>
-          <w:hyperlink w:anchor="_Toc196607730" w:history="1">
+          <w:hyperlink w:anchor="_Toc196608748" w:history="1">
             <w:r>
               <w:rPr>
                 <w:rStyle w:val="Hyperlink"/>
@@ -1669,7 +1669,7 @@
                 <w:noProof/>
                 <w:webHidden/>
               </w:rPr>
-              <w:instrText xml:space="preserve"> PAGEREF _Toc196607730 \h </w:instrText>
+              <w:instrText xml:space="preserve"> PAGEREF _Toc196608748 \h </w:instrText>
             </w:r>
             <w:r>
               <w:rPr>
@@ -1714,7 +1714,7 @@
               <w:lang w:eastAsia="en-GB"/>
             </w:rPr>
           </w:pPr>
-          <w:hyperlink w:anchor="_Toc196607731" w:history="1">
+          <w:hyperlink w:anchor="_Toc196608749" w:history="1">
             <w:r>
               <w:rPr>
                 <w:rStyle w:val="Hyperlink"/>
@@ -1741,7 +1741,7 @@
                 <w:noProof/>
                 <w:webHidden/>
               </w:rPr>
-              <w:instrText xml:space="preserve"> PAGEREF _Toc196607731 \h </w:instrText>
+              <w:instrText xml:space="preserve"> PAGEREF _Toc196608749 \h </w:instrText>
             </w:r>
             <w:r>
               <w:rPr>
@@ -1786,7 +1786,7 @@
               <w:lang w:eastAsia="en-GB"/>
             </w:rPr>
           </w:pPr>
-          <w:hyperlink w:anchor="_Toc196607732" w:history="1">
+          <w:hyperlink w:anchor="_Toc196608750" w:history="1">
             <w:r>
               <w:rPr>
                 <w:rStyle w:val="Hyperlink"/>
@@ -1813,7 +1813,7 @@
                 <w:noProof/>
                 <w:webHidden/>
               </w:rPr>
-              <w:instrText xml:space="preserve"> PAGEREF _Toc196607732 \h </w:instrText>
+              <w:instrText xml:space="preserve"> PAGEREF _Toc196608750 \h </w:instrText>
             </w:r>
             <w:r>
               <w:rPr>
@@ -1858,7 +1858,7 @@
               <w:lang w:eastAsia="en-GB"/>
             </w:rPr>
           </w:pPr>
-          <w:hyperlink w:anchor="_Toc196607733" w:history="1">
+          <w:hyperlink w:anchor="_Toc196608751" w:history="1">
             <w:r>
               <w:rPr>
                 <w:rStyle w:val="Hyperlink"/>
@@ -1885,7 +1885,7 @@
                 <w:noProof/>
                 <w:webHidden/>
               </w:rPr>
-              <w:instrText xml:space="preserve"> PAGEREF _Toc196607733 \h </w:instrText>
+              <w:instrText xml:space="preserve"> PAGEREF _Toc196608751 \h </w:instrText>
             </w:r>
             <w:r>
               <w:rPr>
@@ -1930,7 +1930,7 @@
               <w:lang w:eastAsia="en-GB"/>
             </w:rPr>
           </w:pPr>
-          <w:hyperlink w:anchor="_Toc196607734" w:history="1">
+          <w:hyperlink w:anchor="_Toc196608752" w:history="1">
             <w:r>
               <w:rPr>
                 <w:rStyle w:val="Hyperlink"/>
@@ -1957,7 +1957,7 @@
                 <w:noProof/>
                 <w:webHidden/>
               </w:rPr>
-              <w:instrText xml:space="preserve"> PAGEREF _Toc196607734 \h </w:instrText>
+              <w:instrText xml:space="preserve"> PAGEREF _Toc196608752 \h </w:instrText>
             </w:r>
             <w:r>
               <w:rPr>
@@ -2002,7 +2002,7 @@
               <w:lang w:eastAsia="en-GB"/>
             </w:rPr>
           </w:pPr>
-          <w:hyperlink w:anchor="_Toc196607735" w:history="1">
+          <w:hyperlink w:anchor="_Toc196608753" w:history="1">
             <w:r>
               <w:rPr>
                 <w:rStyle w:val="Hyperlink"/>
@@ -2029,7 +2029,7 @@
                 <w:noProof/>
                 <w:webHidden/>
               </w:rPr>
-              <w:instrText xml:space="preserve"> PAGEREF _Toc196607735 \h </w:instrText>
+              <w:instrText xml:space="preserve"> PAGEREF _Toc196608753 \h </w:instrText>
             </w:r>
             <w:r>
               <w:rPr>
@@ -2074,7 +2074,7 @@
               <w:lang w:eastAsia="en-GB"/>
             </w:rPr>
           </w:pPr>
-          <w:hyperlink w:anchor="_Toc196607736" w:history="1">
+          <w:hyperlink w:anchor="_Toc196608754" w:history="1">
             <w:r>
               <w:rPr>
                 <w:rStyle w:val="Hyperlink"/>
@@ -2101,7 +2101,7 @@
                 <w:noProof/>
                 <w:webHidden/>
               </w:rPr>
-              <w:instrText xml:space="preserve"> PAGEREF _Toc196607736 \h </w:instrText>
+              <w:instrText xml:space="preserve"> PAGEREF _Toc196608754 \h </w:instrText>
             </w:r>
             <w:r>
               <w:rPr>
@@ -2146,7 +2146,7 @@
               <w:lang w:eastAsia="en-GB"/>
             </w:rPr>
           </w:pPr>
-          <w:hyperlink w:anchor="_Toc196607737" w:history="1">
+          <w:hyperlink w:anchor="_Toc196608755" w:history="1">
             <w:r>
               <w:rPr>
                 <w:rStyle w:val="Hyperlink"/>
@@ -2173,7 +2173,7 @@
                 <w:noProof/>
                 <w:webHidden/>
               </w:rPr>
-              <w:instrText xml:space="preserve"> PAGEREF _Toc196607737 \h </w:instrText>
+              <w:instrText xml:space="preserve"> PAGEREF _Toc196608755 \h </w:instrText>
             </w:r>
             <w:r>
               <w:rPr>
@@ -2218,7 +2218,7 @@
               <w:lang w:eastAsia="en-GB"/>
             </w:rPr>
           </w:pPr>
-          <w:hyperlink w:anchor="_Toc196607738" w:history="1">
+          <w:hyperlink w:anchor="_Toc196608756" w:history="1">
             <w:r>
               <w:rPr>
                 <w:rStyle w:val="Hyperlink"/>
@@ -2245,7 +2245,7 @@
                 <w:noProof/>
                 <w:webHidden/>
               </w:rPr>
-              <w:instrText xml:space="preserve"> PAGEREF _Toc196607738 \h </w:instrText>
+              <w:instrText xml:space="preserve"> PAGEREF _Toc196608756 \h </w:instrText>
             </w:r>
             <w:r>
               <w:rPr>
@@ -2290,7 +2290,7 @@
               <w:lang w:eastAsia="en-GB"/>
             </w:rPr>
           </w:pPr>
-          <w:hyperlink w:anchor="_Toc196607739" w:history="1">
+          <w:hyperlink w:anchor="_Toc196608757" w:history="1">
             <w:r>
               <w:rPr>
                 <w:rStyle w:val="Hyperlink"/>
@@ -2317,7 +2317,7 @@
                 <w:noProof/>
                 <w:webHidden/>
               </w:rPr>
-              <w:instrText xml:space="preserve"> PAGEREF _Toc196607739 \h </w:instrText>
+              <w:instrText xml:space="preserve"> PAGEREF _Toc196608757 \h </w:instrText>
             </w:r>
             <w:r>
               <w:rPr>
@@ -2362,7 +2362,7 @@
               <w:lang w:eastAsia="en-GB"/>
             </w:rPr>
           </w:pPr>
-          <w:hyperlink w:anchor="_Toc196607740" w:history="1">
+          <w:hyperlink w:anchor="_Toc196608758" w:history="1">
             <w:r>
               <w:rPr>
                 <w:rStyle w:val="Hyperlink"/>
@@ -2389,7 +2389,7 @@
                 <w:noProof/>
                 <w:webHidden/>
               </w:rPr>
-              <w:instrText xml:space="preserve"> PAGEREF _Toc196607740 \h </w:instrText>
+              <w:instrText xml:space="preserve"> PAGEREF _Toc196608758 \h </w:instrText>
             </w:r>
             <w:r>
               <w:rPr>
@@ -2434,7 +2434,7 @@
               <w:lang w:eastAsia="en-GB"/>
             </w:rPr>
           </w:pPr>
-          <w:hyperlink w:anchor="_Toc196607741" w:history="1">
+          <w:hyperlink w:anchor="_Toc196608759" w:history="1">
             <w:r>
               <w:rPr>
                 <w:rStyle w:val="Hyperlink"/>
@@ -2461,7 +2461,7 @@
                 <w:noProof/>
                 <w:webHidden/>
               </w:rPr>
-              <w:instrText xml:space="preserve"> PAGEREF _Toc196607741 \h </w:instrText>
+              <w:instrText xml:space="preserve"> PAGEREF _Toc196608759 \h </w:instrText>
             </w:r>
             <w:r>
               <w:rPr>
@@ -2506,7 +2506,7 @@
               <w:lang w:eastAsia="en-GB"/>
             </w:rPr>
           </w:pPr>
-          <w:hyperlink w:anchor="_Toc196607742" w:history="1">
+          <w:hyperlink w:anchor="_Toc196608760" w:history="1">
             <w:r>
               <w:rPr>
                 <w:rStyle w:val="Hyperlink"/>
@@ -2533,7 +2533,7 @@
                 <w:noProof/>
                 <w:webHidden/>
               </w:rPr>
-              <w:instrText xml:space="preserve"> PAGEREF _Toc196607742 \h </w:instrText>
+              <w:instrText xml:space="preserve"> PAGEREF _Toc196608760 \h </w:instrText>
             </w:r>
             <w:r>
               <w:rPr>
@@ -2578,7 +2578,7 @@
               <w:lang w:eastAsia="en-GB"/>
             </w:rPr>
           </w:pPr>
-          <w:hyperlink w:anchor="_Toc196607743" w:history="1">
+          <w:hyperlink w:anchor="_Toc196608761" w:history="1">
             <w:r>
               <w:rPr>
                 <w:rStyle w:val="Hyperlink"/>
@@ -2605,7 +2605,7 @@
                 <w:noProof/>
                 <w:webHidden/>
               </w:rPr>
-              <w:instrText xml:space="preserve"> PAGEREF _Toc196607743 \h </w:instrText>
+              <w:instrText xml:space="preserve"> PAGEREF _Toc196608761 \h </w:instrText>
             </w:r>
             <w:r>
               <w:rPr>
@@ -2650,7 +2650,7 @@
               <w:lang w:eastAsia="en-GB"/>
             </w:rPr>
           </w:pPr>
-          <w:hyperlink w:anchor="_Toc196607744" w:history="1">
+          <w:hyperlink w:anchor="_Toc196608762" w:history="1">
             <w:r>
               <w:rPr>
                 <w:rStyle w:val="Hyperlink"/>
@@ -2677,7 +2677,7 @@
                 <w:noProof/>
                 <w:webHidden/>
               </w:rPr>
-              <w:instrText xml:space="preserve"> PAGEREF _Toc196607744 \h </w:instrText>
+              <w:instrText xml:space="preserve"> PAGEREF _Toc196608762 \h </w:instrText>
             </w:r>
             <w:r>
               <w:rPr>
@@ -2722,7 +2722,7 @@
               <w:lang w:eastAsia="en-GB"/>
             </w:rPr>
           </w:pPr>
-          <w:hyperlink w:anchor="_Toc196607745" w:history="1">
+          <w:hyperlink w:anchor="_Toc196608763" w:history="1">
             <w:r>
               <w:rPr>
                 <w:rStyle w:val="Hyperlink"/>
@@ -2749,7 +2749,7 @@
                 <w:noProof/>
                 <w:webHidden/>
               </w:rPr>
-              <w:instrText xml:space="preserve"> PAGEREF _Toc196607745 \h </w:instrText>
+              <w:instrText xml:space="preserve"> PAGEREF _Toc196608763 \h </w:instrText>
             </w:r>
             <w:r>
               <w:rPr>
@@ -2794,7 +2794,7 @@
               <w:lang w:eastAsia="en-GB"/>
             </w:rPr>
           </w:pPr>
-          <w:hyperlink w:anchor="_Toc196607746" w:history="1">
+          <w:hyperlink w:anchor="_Toc196608764" w:history="1">
             <w:r>
               <w:rPr>
                 <w:rStyle w:val="Hyperlink"/>
@@ -2821,7 +2821,7 @@
                 <w:noProof/>
                 <w:webHidden/>
               </w:rPr>
-              <w:instrText xml:space="preserve"> PAGEREF _Toc196607746 \h </w:instrText>
+              <w:instrText xml:space="preserve"> PAGEREF _Toc196608764 \h </w:instrText>
             </w:r>
             <w:r>
               <w:rPr>
@@ -2866,7 +2866,7 @@
               <w:lang w:eastAsia="en-GB"/>
             </w:rPr>
           </w:pPr>
-          <w:hyperlink w:anchor="_Toc196607747" w:history="1">
+          <w:hyperlink w:anchor="_Toc196608765" w:history="1">
             <w:r>
               <w:rPr>
                 <w:rStyle w:val="Hyperlink"/>
@@ -2893,7 +2893,7 @@
                 <w:noProof/>
                 <w:webHidden/>
               </w:rPr>
-              <w:instrText xml:space="preserve"> PAGEREF _Toc196607747 \h </w:instrText>
+              <w:instrText xml:space="preserve"> PAGEREF _Toc196608765 \h </w:instrText>
             </w:r>
             <w:r>
               <w:rPr>
@@ -2938,7 +2938,7 @@
               <w:lang w:eastAsia="en-GB"/>
             </w:rPr>
           </w:pPr>
-          <w:hyperlink w:anchor="_Toc196607748" w:history="1">
+          <w:hyperlink w:anchor="_Toc196608766" w:history="1">
             <w:r>
               <w:rPr>
                 <w:rStyle w:val="Hyperlink"/>
@@ -2965,7 +2965,7 @@
                 <w:noProof/>
                 <w:webHidden/>
               </w:rPr>
-              <w:instrText xml:space="preserve"> PAGEREF _Toc196607748 \h </w:instrText>
+              <w:instrText xml:space="preserve"> PAGEREF _Toc196608766 \h </w:instrText>
             </w:r>
             <w:r>
               <w:rPr>
@@ -3010,7 +3010,7 @@
               <w:lang w:eastAsia="en-GB"/>
             </w:rPr>
           </w:pPr>
-          <w:hyperlink w:anchor="_Toc196607749" w:history="1">
+          <w:hyperlink w:anchor="_Toc196608767" w:history="1">
             <w:r>
               <w:rPr>
                 <w:rStyle w:val="Hyperlink"/>
@@ -3037,7 +3037,7 @@
                 <w:noProof/>
                 <w:webHidden/>
               </w:rPr>
-              <w:instrText xml:space="preserve"> PAGEREF _Toc196607749 \h </w:instrText>
+              <w:instrText xml:space="preserve"> PAGEREF _Toc196608767 \h </w:instrText>
             </w:r>
             <w:r>
               <w:rPr>
@@ -3082,7 +3082,7 @@
               <w:lang w:eastAsia="en-GB"/>
             </w:rPr>
           </w:pPr>
-          <w:hyperlink w:anchor="_Toc196607750" w:history="1">
+          <w:hyperlink w:anchor="_Toc196608768" w:history="1">
             <w:r>
               <w:rPr>
                 <w:rStyle w:val="Hyperlink"/>
@@ -3109,7 +3109,7 @@
                 <w:noProof/>
                 <w:webHidden/>
               </w:rPr>
-              <w:instrText xml:space="preserve"> PAGEREF _Toc196607750 \h </w:instrText>
+              <w:instrText xml:space="preserve"> PAGEREF _Toc196608768 \h </w:instrText>
             </w:r>
             <w:r>
               <w:rPr>
@@ -3154,7 +3154,7 @@
               <w:lang w:eastAsia="en-GB"/>
             </w:rPr>
           </w:pPr>
-          <w:hyperlink w:anchor="_Toc196607751" w:history="1">
+          <w:hyperlink w:anchor="_Toc196608769" w:history="1">
             <w:r>
               <w:rPr>
                 <w:rStyle w:val="Hyperlink"/>
@@ -3181,7 +3181,7 @@
                 <w:noProof/>
                 <w:webHidden/>
               </w:rPr>
-              <w:instrText xml:space="preserve"> PAGEREF _Toc196607751 \h </w:instrText>
+              <w:instrText xml:space="preserve"> PAGEREF _Toc196608769 \h </w:instrText>
             </w:r>
             <w:r>
               <w:rPr>
@@ -3201,7 +3201,7 @@
                 <w:noProof/>
                 <w:webHidden/>
               </w:rPr>
-              <w:t>18</w:t>
+              <w:t>17</w:t>
             </w:r>
             <w:r>
               <w:rPr>
@@ -3226,7 +3226,7 @@
               <w:lang w:eastAsia="en-GB"/>
             </w:rPr>
           </w:pPr>
-          <w:hyperlink w:anchor="_Toc196607752" w:history="1">
+          <w:hyperlink w:anchor="_Toc196608770" w:history="1">
             <w:r>
               <w:rPr>
                 <w:rStyle w:val="Hyperlink"/>
@@ -3253,7 +3253,7 @@
                 <w:noProof/>
                 <w:webHidden/>
               </w:rPr>
-              <w:instrText xml:space="preserve"> PAGEREF _Toc196607752 \h </w:instrText>
+              <w:instrText xml:space="preserve"> PAGEREF _Toc196608770 \h </w:instrText>
             </w:r>
             <w:r>
               <w:rPr>
@@ -3298,7 +3298,7 @@
               <w:lang w:eastAsia="en-GB"/>
             </w:rPr>
           </w:pPr>
-          <w:hyperlink w:anchor="_Toc196607753" w:history="1">
+          <w:hyperlink w:anchor="_Toc196608771" w:history="1">
             <w:r>
               <w:rPr>
                 <w:rStyle w:val="Hyperlink"/>
@@ -3325,7 +3325,7 @@
                 <w:noProof/>
                 <w:webHidden/>
               </w:rPr>
-              <w:instrText xml:space="preserve"> PAGEREF _Toc196607753 \h </w:instrText>
+              <w:instrText xml:space="preserve"> PAGEREF _Toc196608771 \h </w:instrText>
             </w:r>
             <w:r>
               <w:rPr>
@@ -3370,7 +3370,7 @@
               <w:lang w:eastAsia="en-GB"/>
             </w:rPr>
           </w:pPr>
-          <w:hyperlink w:anchor="_Toc196607754" w:history="1">
+          <w:hyperlink w:anchor="_Toc196608772" w:history="1">
             <w:r>
               <w:rPr>
                 <w:rStyle w:val="Hyperlink"/>
@@ -3397,7 +3397,7 @@
                 <w:noProof/>
                 <w:webHidden/>
               </w:rPr>
-              <w:instrText xml:space="preserve"> PAGEREF _Toc196607754 \h </w:instrText>
+              <w:instrText xml:space="preserve"> PAGEREF _Toc196608772 \h </w:instrText>
             </w:r>
             <w:r>
               <w:rPr>
@@ -3417,7 +3417,7 @@
                 <w:noProof/>
                 <w:webHidden/>
               </w:rPr>
-              <w:t>19</w:t>
+              <w:t>18</w:t>
             </w:r>
             <w:r>
               <w:rPr>
@@ -3442,7 +3442,7 @@
               <w:lang w:eastAsia="en-GB"/>
             </w:rPr>
           </w:pPr>
-          <w:hyperlink w:anchor="_Toc196607755" w:history="1">
+          <w:hyperlink w:anchor="_Toc196608773" w:history="1">
             <w:r>
               <w:rPr>
                 <w:rStyle w:val="Hyperlink"/>
@@ -3469,7 +3469,7 @@
                 <w:noProof/>
                 <w:webHidden/>
               </w:rPr>
-              <w:instrText xml:space="preserve"> PAGEREF _Toc196607755 \h </w:instrText>
+              <w:instrText xml:space="preserve"> PAGEREF _Toc196608773 \h </w:instrText>
             </w:r>
             <w:r>
               <w:rPr>
@@ -3514,7 +3514,7 @@
               <w:lang w:eastAsia="en-GB"/>
             </w:rPr>
           </w:pPr>
-          <w:hyperlink w:anchor="_Toc196607756" w:history="1">
+          <w:hyperlink w:anchor="_Toc196608774" w:history="1">
             <w:r>
               <w:rPr>
                 <w:rStyle w:val="Hyperlink"/>
@@ -3541,7 +3541,7 @@
                 <w:noProof/>
                 <w:webHidden/>
               </w:rPr>
-              <w:instrText xml:space="preserve"> PAGEREF _Toc196607756 \h </w:instrText>
+              <w:instrText xml:space="preserve"> PAGEREF _Toc196608774 \h </w:instrText>
             </w:r>
             <w:r>
               <w:rPr>
@@ -3561,7 +3561,7 @@
                 <w:noProof/>
                 <w:webHidden/>
               </w:rPr>
-              <w:t>20</w:t>
+              <w:t>19</w:t>
             </w:r>
             <w:r>
               <w:rPr>
@@ -3586,7 +3586,7 @@
               <w:lang w:eastAsia="en-GB"/>
             </w:rPr>
           </w:pPr>
-          <w:hyperlink w:anchor="_Toc196607757" w:history="1">
+          <w:hyperlink w:anchor="_Toc196608775" w:history="1">
             <w:r>
               <w:rPr>
                 <w:rStyle w:val="Hyperlink"/>
@@ -3613,7 +3613,7 @@
                 <w:noProof/>
                 <w:webHidden/>
               </w:rPr>
-              <w:instrText xml:space="preserve"> PAGEREF _Toc196607757 \h </w:instrText>
+              <w:instrText xml:space="preserve"> PAGEREF _Toc196608775 \h </w:instrText>
             </w:r>
             <w:r>
               <w:rPr>
@@ -3658,7 +3658,7 @@
               <w:lang w:eastAsia="en-GB"/>
             </w:rPr>
           </w:pPr>
-          <w:hyperlink w:anchor="_Toc196607758" w:history="1">
+          <w:hyperlink w:anchor="_Toc196608776" w:history="1">
             <w:r>
               <w:rPr>
                 <w:rStyle w:val="Hyperlink"/>
@@ -3685,7 +3685,7 @@
                 <w:noProof/>
                 <w:webHidden/>
               </w:rPr>
-              <w:instrText xml:space="preserve"> PAGEREF _Toc196607758 \h </w:instrText>
+              <w:instrText xml:space="preserve"> PAGEREF _Toc196608776 \h </w:instrText>
             </w:r>
             <w:r>
               <w:rPr>
@@ -3730,7 +3730,7 @@
               <w:lang w:eastAsia="en-GB"/>
             </w:rPr>
           </w:pPr>
-          <w:hyperlink w:anchor="_Toc196607759" w:history="1">
+          <w:hyperlink w:anchor="_Toc196608777" w:history="1">
             <w:r>
               <w:rPr>
                 <w:rStyle w:val="Hyperlink"/>
@@ -3757,7 +3757,7 @@
                 <w:noProof/>
                 <w:webHidden/>
               </w:rPr>
-              <w:instrText xml:space="preserve"> PAGEREF _Toc196607759 \h </w:instrText>
+              <w:instrText xml:space="preserve"> PAGEREF _Toc196608777 \h </w:instrText>
             </w:r>
             <w:r>
               <w:rPr>
@@ -3802,7 +3802,7 @@
               <w:lang w:eastAsia="en-GB"/>
             </w:rPr>
           </w:pPr>
-          <w:hyperlink w:anchor="_Toc196607760" w:history="1">
+          <w:hyperlink w:anchor="_Toc196608778" w:history="1">
             <w:r>
               <w:rPr>
                 <w:rStyle w:val="Hyperlink"/>
@@ -3829,7 +3829,7 @@
                 <w:noProof/>
                 <w:webHidden/>
               </w:rPr>
-              <w:instrText xml:space="preserve"> PAGEREF _Toc196607760 \h </w:instrText>
+              <w:instrText xml:space="preserve"> PAGEREF _Toc196608778 \h </w:instrText>
             </w:r>
             <w:r>
               <w:rPr>
@@ -3874,7 +3874,7 @@
               <w:lang w:eastAsia="en-GB"/>
             </w:rPr>
           </w:pPr>
-          <w:hyperlink w:anchor="_Toc196607761" w:history="1">
+          <w:hyperlink w:anchor="_Toc196608779" w:history="1">
             <w:r>
               <w:rPr>
                 <w:rStyle w:val="Hyperlink"/>
@@ -3901,7 +3901,7 @@
                 <w:noProof/>
                 <w:webHidden/>
               </w:rPr>
-              <w:instrText xml:space="preserve"> PAGEREF _Toc196607761 \h </w:instrText>
+              <w:instrText xml:space="preserve"> PAGEREF _Toc196608779 \h </w:instrText>
             </w:r>
             <w:r>
               <w:rPr>
@@ -3946,7 +3946,7 @@
               <w:lang w:eastAsia="en-GB"/>
             </w:rPr>
           </w:pPr>
-          <w:hyperlink w:anchor="_Toc196607762" w:history="1">
+          <w:hyperlink w:anchor="_Toc196608780" w:history="1">
             <w:r>
               <w:rPr>
                 <w:rStyle w:val="Hyperlink"/>
@@ -3973,7 +3973,7 @@
                 <w:noProof/>
                 <w:webHidden/>
               </w:rPr>
-              <w:instrText xml:space="preserve"> PAGEREF _Toc196607762 \h </w:instrText>
+              <w:instrText xml:space="preserve"> PAGEREF _Toc196608780 \h </w:instrText>
             </w:r>
             <w:r>
               <w:rPr>
@@ -3993,7 +3993,7 @@
                 <w:noProof/>
                 <w:webHidden/>
               </w:rPr>
-              <w:t>21</w:t>
+              <w:t>20</w:t>
             </w:r>
             <w:r>
               <w:rPr>
@@ -4018,7 +4018,7 @@
               <w:lang w:eastAsia="en-GB"/>
             </w:rPr>
           </w:pPr>
-          <w:hyperlink w:anchor="_Toc196607763" w:history="1">
+          <w:hyperlink w:anchor="_Toc196608781" w:history="1">
             <w:r>
               <w:rPr>
                 <w:rStyle w:val="Hyperlink"/>
@@ -4045,7 +4045,7 @@
                 <w:noProof/>
                 <w:webHidden/>
               </w:rPr>
-              <w:instrText xml:space="preserve"> PAGEREF _Toc196607763 \h </w:instrText>
+              <w:instrText xml:space="preserve"> PAGEREF _Toc196608781 \h </w:instrText>
             </w:r>
             <w:r>
               <w:rPr>
@@ -4090,7 +4090,7 @@
               <w:lang w:eastAsia="en-GB"/>
             </w:rPr>
           </w:pPr>
-          <w:hyperlink w:anchor="_Toc196607764" w:history="1">
+          <w:hyperlink w:anchor="_Toc196608782" w:history="1">
             <w:r>
               <w:rPr>
                 <w:rStyle w:val="Hyperlink"/>
@@ -4117,7 +4117,7 @@
                 <w:noProof/>
                 <w:webHidden/>
               </w:rPr>
-              <w:instrText xml:space="preserve"> PAGEREF _Toc196607764 \h </w:instrText>
+              <w:instrText xml:space="preserve"> PAGEREF _Toc196608782 \h </w:instrText>
             </w:r>
             <w:r>
               <w:rPr>
@@ -4162,7 +4162,7 @@
               <w:lang w:eastAsia="en-GB"/>
             </w:rPr>
           </w:pPr>
-          <w:hyperlink w:anchor="_Toc196607765" w:history="1">
+          <w:hyperlink w:anchor="_Toc196608783" w:history="1">
             <w:r>
               <w:rPr>
                 <w:rStyle w:val="Hyperlink"/>
@@ -4189,7 +4189,7 @@
                 <w:noProof/>
                 <w:webHidden/>
               </w:rPr>
-              <w:instrText xml:space="preserve"> PAGEREF _Toc196607765 \h </w:instrText>
+              <w:instrText xml:space="preserve"> PAGEREF _Toc196608783 \h </w:instrText>
             </w:r>
             <w:r>
               <w:rPr>
@@ -4234,7 +4234,7 @@
               <w:lang w:eastAsia="en-GB"/>
             </w:rPr>
           </w:pPr>
-          <w:hyperlink w:anchor="_Toc196607766" w:history="1">
+          <w:hyperlink w:anchor="_Toc196608784" w:history="1">
             <w:r>
               <w:rPr>
                 <w:rStyle w:val="Hyperlink"/>
@@ -4261,7 +4261,7 @@
                 <w:noProof/>
                 <w:webHidden/>
               </w:rPr>
-              <w:instrText xml:space="preserve"> PAGEREF _Toc196607766 \h </w:instrText>
+              <w:instrText xml:space="preserve"> PAGEREF _Toc196608784 \h </w:instrText>
             </w:r>
             <w:r>
               <w:rPr>
@@ -4306,13 +4306,13 @@
               <w:lang w:eastAsia="en-GB"/>
             </w:rPr>
           </w:pPr>
-          <w:hyperlink w:anchor="_Toc196607767" w:history="1">
+          <w:hyperlink w:anchor="_Toc196608785" w:history="1">
             <w:r>
               <w:rPr>
                 <w:rStyle w:val="Hyperlink"/>
                 <w:noProof/>
               </w:rPr>
-              <w:t>Overcoming Challenges with Development</w:t>
+              <w:t>What I’ve Learned and Improved During the Project</w:t>
             </w:r>
             <w:r>
               <w:rPr>
@@ -4333,7 +4333,7 @@
                 <w:noProof/>
                 <w:webHidden/>
               </w:rPr>
-              <w:instrText xml:space="preserve"> PAGEREF _Toc196607767 \h </w:instrText>
+              <w:instrText xml:space="preserve"> PAGEREF _Toc196608785 \h </w:instrText>
             </w:r>
             <w:r>
               <w:rPr>
@@ -4378,13 +4378,13 @@
               <w:lang w:eastAsia="en-GB"/>
             </w:rPr>
           </w:pPr>
-          <w:hyperlink w:anchor="_Toc196607768" w:history="1">
+          <w:hyperlink w:anchor="_Toc196608786" w:history="1">
             <w:r>
               <w:rPr>
                 <w:rStyle w:val="Hyperlink"/>
                 <w:noProof/>
               </w:rPr>
-              <w:t>What I’ve Learned and Improved During the Project</w:t>
+              <w:t>Final thoughts and discussion</w:t>
             </w:r>
             <w:r>
               <w:rPr>
@@ -4405,7 +4405,7 @@
                 <w:noProof/>
                 <w:webHidden/>
               </w:rPr>
-              <w:instrText xml:space="preserve"> PAGEREF _Toc196607768 \h </w:instrText>
+              <w:instrText xml:space="preserve"> PAGEREF _Toc196608786 \h </w:instrText>
             </w:r>
             <w:r>
               <w:rPr>
@@ -4450,13 +4450,13 @@
               <w:lang w:eastAsia="en-GB"/>
             </w:rPr>
           </w:pPr>
-          <w:hyperlink w:anchor="_Toc196607769" w:history="1">
+          <w:hyperlink w:anchor="_Toc196608787" w:history="1">
             <w:r>
               <w:rPr>
                 <w:rStyle w:val="Hyperlink"/>
                 <w:noProof/>
               </w:rPr>
-              <w:t>Final thoughts and discussion</w:t>
+              <w:t>Refences</w:t>
             </w:r>
             <w:r>
               <w:rPr>
@@ -4477,7 +4477,7 @@
                 <w:noProof/>
                 <w:webHidden/>
               </w:rPr>
-              <w:instrText xml:space="preserve"> PAGEREF _Toc196607769 \h </w:instrText>
+              <w:instrText xml:space="preserve"> PAGEREF _Toc196608787 \h </w:instrText>
             </w:r>
             <w:r>
               <w:rPr>
@@ -4497,79 +4497,7 @@
                 <w:noProof/>
                 <w:webHidden/>
               </w:rPr>
-              <w:t>23</w:t>
-            </w:r>
-            <w:r>
-              <w:rPr>
-                <w:noProof/>
-                <w:webHidden/>
-              </w:rPr>
-              <w:fldChar w:fldCharType="end"/>
-            </w:r>
-          </w:hyperlink>
-        </w:p>
-        <w:p>
-          <w:pPr>
-            <w:pStyle w:val="TOC1"/>
-            <w:tabs>
-              <w:tab w:val="right" w:leader="dot" w:pos="9016"/>
-            </w:tabs>
-            <w:rPr>
-              <w:rFonts w:eastAsiaTheme="minorEastAsia"/>
-              <w:noProof/>
-              <w:sz w:val="24"/>
-              <w:szCs w:val="24"/>
-              <w:lang w:eastAsia="en-GB"/>
-            </w:rPr>
-          </w:pPr>
-          <w:hyperlink w:anchor="_Toc196607770" w:history="1">
-            <w:r>
-              <w:rPr>
-                <w:rStyle w:val="Hyperlink"/>
-                <w:noProof/>
-              </w:rPr>
-              <w:t>Refences</w:t>
-            </w:r>
-            <w:r>
-              <w:rPr>
-                <w:noProof/>
-                <w:webHidden/>
-              </w:rPr>
-              <w:tab/>
-            </w:r>
-            <w:r>
-              <w:rPr>
-                <w:noProof/>
-                <w:webHidden/>
-              </w:rPr>
-              <w:fldChar w:fldCharType="begin"/>
-            </w:r>
-            <w:r>
-              <w:rPr>
-                <w:noProof/>
-                <w:webHidden/>
-              </w:rPr>
-              <w:instrText xml:space="preserve"> PAGEREF _Toc196607770 \h </w:instrText>
-            </w:r>
-            <w:r>
-              <w:rPr>
-                <w:noProof/>
-                <w:webHidden/>
-              </w:rPr>
-            </w:r>
-            <w:r>
-              <w:rPr>
-                <w:noProof/>
-                <w:webHidden/>
-              </w:rPr>
-              <w:fldChar w:fldCharType="separate"/>
-            </w:r>
-            <w:r>
-              <w:rPr>
-                <w:noProof/>
-                <w:webHidden/>
-              </w:rPr>
-              <w:t>23</w:t>
+              <w:t>22</w:t>
             </w:r>
             <w:r>
               <w:rPr>
@@ -4640,7 +4568,7 @@
       <w:pPr>
         <w:pStyle w:val="Heading1"/>
       </w:pPr>
-      <w:bookmarkStart w:id="0" w:name="_Toc196607708"/>
+      <w:bookmarkStart w:id="0" w:name="_Toc196608726"/>
       <w:r>
         <w:lastRenderedPageBreak/>
         <w:t>Abstract</w:t>
@@ -4800,7 +4728,7 @@
       <w:pPr>
         <w:pStyle w:val="Heading1"/>
       </w:pPr>
-      <w:bookmarkStart w:id="1" w:name="_Toc196607709"/>
+      <w:bookmarkStart w:id="1" w:name="_Toc196608727"/>
       <w:r>
         <w:t>Market Research</w:t>
       </w:r>
@@ -4843,7 +4771,7 @@
       <w:pPr>
         <w:pStyle w:val="Heading2"/>
       </w:pPr>
-      <w:bookmarkStart w:id="2" w:name="_Toc196607710"/>
+      <w:bookmarkStart w:id="2" w:name="_Toc196608728"/>
       <w:r>
         <w:t>Operating systems</w:t>
       </w:r>
@@ -4986,7 +4914,7 @@
       <w:pPr>
         <w:pStyle w:val="Heading2"/>
       </w:pPr>
-      <w:bookmarkStart w:id="3" w:name="_Toc196607711"/>
+      <w:bookmarkStart w:id="3" w:name="_Toc196608729"/>
       <w:r>
         <w:lastRenderedPageBreak/>
         <w:t>Architecture</w:t>
@@ -5107,7 +5035,7 @@
       <w:pPr>
         <w:pStyle w:val="Heading2"/>
       </w:pPr>
-      <w:bookmarkStart w:id="4" w:name="_Toc196607712"/>
+      <w:bookmarkStart w:id="4" w:name="_Toc196608730"/>
       <w:r>
         <w:t>Devices</w:t>
       </w:r>
@@ -5263,7 +5191,7 @@
       <w:pPr>
         <w:pStyle w:val="Heading1"/>
       </w:pPr>
-      <w:bookmarkStart w:id="5" w:name="_Toc196607713"/>
+      <w:bookmarkStart w:id="5" w:name="_Toc196608731"/>
       <w:r>
         <w:t>ICMS</w:t>
       </w:r>
@@ -5279,7 +5207,7 @@
       <w:pPr>
         <w:pStyle w:val="Heading2"/>
       </w:pPr>
-      <w:bookmarkStart w:id="6" w:name="_Toc196607714"/>
+      <w:bookmarkStart w:id="6" w:name="_Toc196608732"/>
       <w:r>
         <w:t xml:space="preserve">Home </w:t>
       </w:r>
@@ -5297,7 +5225,7 @@
       <w:pPr>
         <w:pStyle w:val="Heading2"/>
       </w:pPr>
-      <w:bookmarkStart w:id="7" w:name="_Toc196607715"/>
+      <w:bookmarkStart w:id="7" w:name="_Toc196608733"/>
       <w:r>
         <w:lastRenderedPageBreak/>
         <w:t>IFTTT</w:t>
@@ -5415,7 +5343,7 @@
       <w:pPr>
         <w:pStyle w:val="Heading2"/>
       </w:pPr>
-      <w:bookmarkStart w:id="8" w:name="_Toc196607716"/>
+      <w:bookmarkStart w:id="8" w:name="_Toc196608734"/>
       <w:r>
         <w:t>Comparison</w:t>
       </w:r>
@@ -5430,7 +5358,7 @@
       <w:pPr>
         <w:pStyle w:val="Heading1"/>
       </w:pPr>
-      <w:bookmarkStart w:id="9" w:name="_Toc196607717"/>
+      <w:bookmarkStart w:id="9" w:name="_Toc196608735"/>
       <w:r>
         <w:t>Product requirements</w:t>
       </w:r>
@@ -5451,7 +5379,7 @@
       <w:pPr>
         <w:pStyle w:val="Heading1"/>
       </w:pPr>
-      <w:bookmarkStart w:id="10" w:name="_Toc196607718"/>
+      <w:bookmarkStart w:id="10" w:name="_Toc196608736"/>
       <w:r>
         <w:t>Expected userbase</w:t>
       </w:r>
@@ -5509,7 +5437,7 @@
       <w:pPr>
         <w:pStyle w:val="Heading1"/>
       </w:pPr>
-      <w:bookmarkStart w:id="11" w:name="_Toc196607719"/>
+      <w:bookmarkStart w:id="11" w:name="_Toc196608737"/>
       <w:r>
         <w:t>Prototyp</w:t>
       </w:r>
@@ -5522,7 +5450,7 @@
       <w:pPr>
         <w:pStyle w:val="Heading2"/>
       </w:pPr>
-      <w:bookmarkStart w:id="12" w:name="_Toc196607720"/>
+      <w:bookmarkStart w:id="12" w:name="_Toc196608738"/>
       <w:r>
         <w:t xml:space="preserve">Lo-Fi </w:t>
       </w:r>
@@ -5564,7 +5492,7 @@
       <w:pPr>
         <w:pStyle w:val="Heading1"/>
       </w:pPr>
-      <w:bookmarkStart w:id="13" w:name="_Toc196607721"/>
+      <w:bookmarkStart w:id="13" w:name="_Toc196608739"/>
       <w:r>
         <w:lastRenderedPageBreak/>
         <w:t>Agile Development</w:t>
@@ -5728,7 +5656,7 @@
       <w:pPr>
         <w:pStyle w:val="Heading2"/>
       </w:pPr>
-      <w:bookmarkStart w:id="14" w:name="_Toc196607722"/>
+      <w:bookmarkStart w:id="14" w:name="_Toc196608740"/>
       <w:r>
         <w:t xml:space="preserve">Expected </w:t>
       </w:r>
@@ -5745,7 +5673,7 @@
       <w:pPr>
         <w:pStyle w:val="Heading2"/>
       </w:pPr>
-      <w:bookmarkStart w:id="15" w:name="_Toc196607723"/>
+      <w:bookmarkStart w:id="15" w:name="_Toc196608741"/>
       <w:r>
         <w:t xml:space="preserve">Unexpected </w:t>
       </w:r>
@@ -5759,7 +5687,7 @@
       <w:pPr>
         <w:pStyle w:val="Heading1"/>
       </w:pPr>
-      <w:bookmarkStart w:id="16" w:name="_Toc196607724"/>
+      <w:bookmarkStart w:id="16" w:name="_Toc196608742"/>
       <w:r>
         <w:lastRenderedPageBreak/>
         <w:t>Git/</w:t>
@@ -5778,7 +5706,7 @@
       <w:pPr>
         <w:pStyle w:val="Heading2"/>
       </w:pPr>
-      <w:bookmarkStart w:id="17" w:name="_Toc196607725"/>
+      <w:bookmarkStart w:id="17" w:name="_Toc196608743"/>
       <w:r>
         <w:t xml:space="preserve">Setting </w:t>
       </w:r>
@@ -5958,7 +5886,7 @@
           <w:szCs w:val="22"/>
         </w:rPr>
       </w:pPr>
-      <w:bookmarkStart w:id="18" w:name="_Toc196607726"/>
+      <w:bookmarkStart w:id="18" w:name="_Toc196608744"/>
       <w:r>
         <w:t>Initial Int</w:t>
       </w:r>
@@ -6090,7 +6018,7 @@
       <w:pPr>
         <w:pStyle w:val="Heading2"/>
       </w:pPr>
-      <w:bookmarkStart w:id="19" w:name="_Toc196607727"/>
+      <w:bookmarkStart w:id="19" w:name="_Toc196608745"/>
       <w:r>
         <w:t>Logging and SSL Support</w:t>
       </w:r>
@@ -6180,7 +6108,7 @@
       <w:pPr>
         <w:pStyle w:val="Heading2"/>
       </w:pPr>
-      <w:bookmarkStart w:id="20" w:name="_Toc196607728"/>
+      <w:bookmarkStart w:id="20" w:name="_Toc196608746"/>
       <w:r>
         <w:lastRenderedPageBreak/>
         <w:t>Extension</w:t>
@@ -6245,7 +6173,7 @@
       <w:pPr>
         <w:pStyle w:val="Heading1"/>
       </w:pPr>
-      <w:bookmarkStart w:id="21" w:name="_Toc196607729"/>
+      <w:bookmarkStart w:id="21" w:name="_Toc196608747"/>
       <w:r>
         <w:t>Surface Level Architecture</w:t>
       </w:r>
@@ -6287,7 +6215,7 @@
       <w:pPr>
         <w:pStyle w:val="Heading2"/>
       </w:pPr>
-      <w:bookmarkStart w:id="22" w:name="_Toc196607730"/>
+      <w:bookmarkStart w:id="22" w:name="_Toc196608748"/>
       <w:r>
         <w:t>Community Store</w:t>
       </w:r>
@@ -6314,7 +6242,7 @@
       <w:pPr>
         <w:pStyle w:val="Heading1"/>
       </w:pPr>
-      <w:bookmarkStart w:id="23" w:name="_Toc196607731"/>
+      <w:bookmarkStart w:id="23" w:name="_Toc196608749"/>
       <w:r>
         <w:t>Social implications</w:t>
       </w:r>
@@ -6467,7 +6395,7 @@
         <w:pStyle w:val="Heading1"/>
       </w:pPr>
       <w:bookmarkStart w:id="24" w:name="_Protecting_users_and"/>
-      <w:bookmarkStart w:id="25" w:name="_Toc196607732"/>
+      <w:bookmarkStart w:id="25" w:name="_Toc196608750"/>
       <w:bookmarkEnd w:id="24"/>
       <w:r>
         <w:t xml:space="preserve">Legal </w:t>
@@ -6749,7 +6677,7 @@
       <w:pPr>
         <w:pStyle w:val="Heading1"/>
       </w:pPr>
-      <w:bookmarkStart w:id="26" w:name="_Toc196607733"/>
+      <w:bookmarkStart w:id="26" w:name="_Toc196608751"/>
       <w:r>
         <w:t xml:space="preserve">Software </w:t>
       </w:r>
@@ -6785,7 +6713,7 @@
       <w:pPr>
         <w:pStyle w:val="Heading2"/>
       </w:pPr>
-      <w:bookmarkStart w:id="27" w:name="_Toc196607734"/>
+      <w:bookmarkStart w:id="27" w:name="_Toc196608752"/>
       <w:r>
         <w:t>Connection methods</w:t>
       </w:r>
@@ -6971,15 +6899,13 @@
       </w:r>
     </w:p>
     <w:p/>
-    <w:p/>
-    <w:p/>
-    <w:p/>
     <w:p>
       <w:pPr>
         <w:pStyle w:val="Heading2"/>
       </w:pPr>
-      <w:bookmarkStart w:id="28" w:name="_Toc196607735"/>
-      <w:r>
+      <w:bookmarkStart w:id="28" w:name="_Toc196608753"/>
+      <w:r>
+        <w:lastRenderedPageBreak/>
         <w:t>Webapp or Native Application?</w:t>
       </w:r>
       <w:bookmarkEnd w:id="28"/>
@@ -7086,7 +7012,7 @@
       <w:pPr>
         <w:pStyle w:val="Heading2"/>
       </w:pPr>
-      <w:bookmarkStart w:id="29" w:name="_Toc196607736"/>
+      <w:bookmarkStart w:id="29" w:name="_Toc196608754"/>
       <w:r>
         <w:t>Svelte</w:t>
       </w:r>
@@ -7103,263 +7029,263 @@
         <w:t>Svelte is a relatively new web framework, building off of what has been learn</w:t>
       </w:r>
       <w:r>
+        <w:t xml:space="preserve">ed </w:t>
+      </w:r>
+      <w:r>
+        <w:t>with other frameworks such as a React</w:t>
+      </w:r>
+      <w:r>
+        <w:t xml:space="preserve"> it has many modern </w:t>
+      </w:r>
+      <w:r>
+        <w:t>JavaScript</w:t>
+      </w:r>
+      <w:r>
+        <w:t xml:space="preserve"> and web features</w:t>
+      </w:r>
+      <w:r>
+        <w:t>.</w:t>
+      </w:r>
+    </w:p>
+    <w:p>
+      <w:r>
+        <w:t>For example, one of the key features is their implementation of server</w:t>
+      </w:r>
+      <w:r>
+        <w:t>-</w:t>
+      </w:r>
+      <w:r>
+        <w:t>side rendering (SSR).</w:t>
+      </w:r>
+      <w:r>
+        <w:t xml:space="preserve"> </w:t>
+      </w:r>
+      <w:r>
+        <w:t xml:space="preserve">Server-side rendering allows the server to render the web page before sending it to </w:t>
+      </w:r>
+      <w:r>
+        <w:t xml:space="preserve">be displayed on </w:t>
+      </w:r>
+      <w:r>
+        <w:t xml:space="preserve">the client. In effect, it becomes a read-only system where the functions and data </w:t>
+      </w:r>
+      <w:r>
+        <w:t xml:space="preserve">retrieval </w:t>
+      </w:r>
+      <w:r>
+        <w:t xml:space="preserve">all occur on the server preventing the client from having direct access to them. This architecture allows the client and server to both be protected from attacks from malicious users. </w:t>
+      </w:r>
+    </w:p>
+    <w:p>
+      <w:r>
+        <w:t>Some issues do come from utilising this architecture though</w:t>
+      </w:r>
+      <w:r>
+        <w:t>. Data</w:t>
+      </w:r>
+      <w:r>
+        <w:t xml:space="preserve"> </w:t>
+      </w:r>
+      <w:r>
+        <w:t xml:space="preserve">stored </w:t>
+      </w:r>
+      <w:r>
+        <w:t>on</w:t>
+      </w:r>
+      <w:r>
+        <w:t xml:space="preserve"> the webpage is still accessible to client, meaning data still needs to be protected and only </w:t>
+      </w:r>
+      <w:r>
+        <w:t xml:space="preserve">retrieved </w:t>
+      </w:r>
+      <w:r>
+        <w:t>when necessary. Another difficul</w:t>
+      </w:r>
+      <w:r>
         <w:t>t</w:t>
       </w:r>
       <w:r>
-        <w:t xml:space="preserve"> with other frameworks such as a React</w:t>
-      </w:r>
-      <w:r>
-        <w:t xml:space="preserve"> it has many modern </w:t>
-      </w:r>
-      <w:r>
-        <w:t>JavaScript</w:t>
-      </w:r>
-      <w:r>
-        <w:t xml:space="preserve"> and web features</w:t>
-      </w:r>
-      <w:r>
-        <w:t>.</w:t>
-      </w:r>
-    </w:p>
-    <w:p>
-      <w:r>
-        <w:t>For example, one of the key features is their implementation of server</w:t>
-      </w:r>
-      <w:r>
-        <w:t>-</w:t>
-      </w:r>
-      <w:r>
-        <w:t>side rendering (SSR).</w:t>
+        <w:t>y</w:t>
+      </w:r>
+      <w:r>
+        <w:t xml:space="preserve"> when using SSR is</w:t>
+      </w:r>
+      <w:r>
+        <w:t xml:space="preserve"> client interaction</w:t>
+      </w:r>
+      <w:r>
+        <w:t>s</w:t>
+      </w:r>
+      <w:r>
+        <w:t xml:space="preserve"> such as submitting forms or data </w:t>
+      </w:r>
+      <w:r>
+        <w:t>from</w:t>
+      </w:r>
+      <w:r>
+        <w:t xml:space="preserve"> the front end to the backend</w:t>
+      </w:r>
+      <w:r>
+        <w:t>. To get around</w:t>
+      </w:r>
+      <w:r>
+        <w:t xml:space="preserve"> this, Svelte uses a system called server actions.</w:t>
       </w:r>
       <w:r>
         <w:t xml:space="preserve"> </w:t>
       </w:r>
       <w:r>
-        <w:t xml:space="preserve">Server-side rendering allows the server to render the web page before sending it to </w:t>
-      </w:r>
-      <w:r>
-        <w:t xml:space="preserve">be displayed on </w:t>
-      </w:r>
-      <w:r>
-        <w:t xml:space="preserve">the client. In effect, it becomes a read-only system where the functions and data </w:t>
-      </w:r>
-      <w:r>
-        <w:t xml:space="preserve">retrieval </w:t>
-      </w:r>
-      <w:r>
-        <w:t xml:space="preserve">all occur on the server preventing the client from having direct access to them. This architecture allows the client and server to both be protected from attacks from malicious users. </w:t>
-      </w:r>
-    </w:p>
-    <w:p>
-      <w:r>
-        <w:t>Some issues do come from utilising this architecture though</w:t>
-      </w:r>
-      <w:r>
-        <w:t>. Data</w:t>
+        <w:t>Server actions are exported functions</w:t>
+      </w:r>
+      <w:r>
+        <w:t xml:space="preserve"> which the</w:t>
+      </w:r>
+      <w:r>
+        <w:t xml:space="preserve"> client has access to</w:t>
+      </w:r>
+      <w:r>
+        <w:t xml:space="preserve">, </w:t>
+      </w:r>
+      <w:r>
+        <w:t>which</w:t>
+      </w:r>
+      <w:r>
+        <w:t xml:space="preserve"> allow the front-end to interact with the server.</w:t>
+      </w:r>
+      <w:r>
+        <w:t xml:space="preserve"> These functions aren’t directly accessible from the front-end but instead are submitted similarly to an http endpoint through forms or fetch requests. </w:t>
       </w:r>
       <w:r>
         <w:t xml:space="preserve"> </w:t>
       </w:r>
-      <w:r>
-        <w:t xml:space="preserve">stored </w:t>
-      </w:r>
-      <w:r>
-        <w:t>on</w:t>
-      </w:r>
-      <w:r>
-        <w:t xml:space="preserve"> the webpage is still accessible to client, meaning data still needs to be protected and only </w:t>
-      </w:r>
-      <w:r>
-        <w:t xml:space="preserve">retrieved </w:t>
-      </w:r>
-      <w:r>
-        <w:t>when necessary. Another difficul</w:t>
-      </w:r>
-      <w:r>
-        <w:t>t</w:t>
-      </w:r>
-      <w:r>
-        <w:t>y</w:t>
-      </w:r>
-      <w:r>
-        <w:t xml:space="preserve"> when using SSR is</w:t>
-      </w:r>
-      <w:r>
-        <w:t xml:space="preserve"> client interaction</w:t>
-      </w:r>
-      <w:r>
-        <w:t>s</w:t>
-      </w:r>
-      <w:r>
-        <w:t xml:space="preserve"> such as submitting forms or data </w:t>
-      </w:r>
-      <w:r>
-        <w:t>from</w:t>
-      </w:r>
-      <w:r>
-        <w:t xml:space="preserve"> the front end to the backend</w:t>
-      </w:r>
-      <w:r>
-        <w:t>. To get around</w:t>
-      </w:r>
-      <w:r>
-        <w:t xml:space="preserve"> this, Svelte uses a system called server actions.</w:t>
+    </w:p>
+    <w:p>
+      <w:r>
+        <w:t>(show some examples here)</w:t>
+      </w:r>
+    </w:p>
+    <w:p>
+      <w:r>
+        <w:t>When submitting a form, all form data is included within the request.</w:t>
+      </w:r>
+    </w:p>
+    <w:p>
+      <w:pPr>
+        <w:pStyle w:val="Heading2"/>
+      </w:pPr>
+      <w:bookmarkStart w:id="30" w:name="_Toc196608755"/>
+      <w:r>
+        <w:t>Tailwind/</w:t>
+      </w:r>
+      <w:r>
+        <w:t>Daisy UI</w:t>
+      </w:r>
+      <w:bookmarkEnd w:id="30"/>
+    </w:p>
+    <w:p>
+      <w:r>
+        <w:t>Tailwind is a CSS framework used to easily modify how different html elements are displayed directly in their definitions, this removes the need for large amounts of CSS files littered around the application. This way of defining element parameters</w:t>
+      </w:r>
+      <w:r>
+        <w:t xml:space="preserve"> in a simple form</w:t>
+      </w:r>
+      <w:r>
+        <w:t xml:space="preserve"> is an incredible resource for developers that </w:t>
+      </w:r>
+      <w:r>
+        <w:t xml:space="preserve">aren’t as </w:t>
+      </w:r>
+      <w:r>
+        <w:t xml:space="preserve">graphic design </w:t>
+      </w:r>
+      <w:r>
+        <w:t>centric.</w:t>
       </w:r>
       <w:r>
         <w:t xml:space="preserve"> </w:t>
       </w:r>
-      <w:r>
-        <w:t>Server actions are exported functions</w:t>
-      </w:r>
-      <w:r>
-        <w:t xml:space="preserve"> which the</w:t>
-      </w:r>
-      <w:r>
-        <w:t xml:space="preserve"> client has access to</w:t>
-      </w:r>
-      <w:r>
-        <w:t xml:space="preserve">, </w:t>
-      </w:r>
-      <w:r>
-        <w:t>which</w:t>
-      </w:r>
-      <w:r>
-        <w:t xml:space="preserve"> allow the front-end to interact with the server.</w:t>
-      </w:r>
-      <w:r>
-        <w:t xml:space="preserve"> These functions aren’t directly accessible from the front-end but instead are submitted similarly to an http endpoint through forms or fetch requests. </w:t>
+    </w:p>
+    <w:p>
+      <w:r>
+        <w:t>Although tailwind comes with many benefits,</w:t>
       </w:r>
       <w:r>
         <w:t xml:space="preserve"> </w:t>
       </w:r>
-    </w:p>
-    <w:p>
-      <w:r>
-        <w:t>(show some examples here)</w:t>
-      </w:r>
-    </w:p>
-    <w:p>
-      <w:r>
-        <w:t>When submitting a form, all form data is included within the request.</w:t>
+      <w:r>
+        <w:t>o</w:t>
+      </w:r>
+      <w:r>
+        <w:t xml:space="preserve">ne pretty significant downside </w:t>
+      </w:r>
+      <w:r>
+        <w:t xml:space="preserve">to tailwind is how complicated some elements can become. Defining </w:t>
+      </w:r>
+      <w:r>
+        <w:t xml:space="preserve">CSS </w:t>
+      </w:r>
+      <w:r>
+        <w:t xml:space="preserve">classes directly in the elements can cause them </w:t>
+      </w:r>
+      <w:r>
+        <w:t xml:space="preserve">to become </w:t>
+      </w:r>
+      <w:r>
+        <w:t>extremely bloated</w:t>
+      </w:r>
+      <w:r>
+        <w:t xml:space="preserve"> and hard to read.</w:t>
+      </w:r>
+    </w:p>
+    <w:p>
+      <w:r>
+        <w:t xml:space="preserve">Daisy UI is a tailwind </w:t>
+      </w:r>
+      <w:r>
+        <w:t>CSS</w:t>
+      </w:r>
+      <w:r>
+        <w:t xml:space="preserve"> </w:t>
+      </w:r>
+      <w:r>
+        <w:t>plugin that comes with pre-made components that can be</w:t>
+      </w:r>
+      <w:r>
+        <w:t xml:space="preserve"> </w:t>
+      </w:r>
+      <w:r>
+        <w:t>used as drop-in replacements for the default html elements.</w:t>
+      </w:r>
+      <w:r>
+        <w:t xml:space="preserve"> All that is necessary to use </w:t>
+      </w:r>
+      <w:r>
+        <w:t>a</w:t>
+      </w:r>
+      <w:r>
+        <w:t xml:space="preserve"> component is</w:t>
+      </w:r>
+      <w:r>
+        <w:t xml:space="preserve"> incl</w:t>
+      </w:r>
+      <w:r>
+        <w:t xml:space="preserve">uding its name </w:t>
+      </w:r>
+      <w:r>
+        <w:t>in the class definition of the element chosen.</w:t>
+      </w:r>
+      <w:r>
+        <w:t xml:space="preserve"> </w:t>
+      </w:r>
+      <w:r>
+        <w:t xml:space="preserve"> </w:t>
       </w:r>
     </w:p>
     <w:p>
       <w:pPr>
         <w:pStyle w:val="Heading2"/>
       </w:pPr>
-      <w:bookmarkStart w:id="30" w:name="_Toc196607737"/>
-      <w:r>
-        <w:t>Tailwind/</w:t>
-      </w:r>
-      <w:r>
-        <w:t>Daisy UI</w:t>
-      </w:r>
-      <w:bookmarkEnd w:id="30"/>
-    </w:p>
-    <w:p>
-      <w:r>
-        <w:t>Tailwind is a CSS framework used to easily modify how different html elements are displayed directly in their definitions, this removes the need for large amounts of CSS files littered around the application. This way of defining element parameters</w:t>
-      </w:r>
-      <w:r>
-        <w:t xml:space="preserve"> in a simple form</w:t>
-      </w:r>
-      <w:r>
-        <w:t xml:space="preserve"> is an incredible resource for developers that </w:t>
-      </w:r>
-      <w:r>
-        <w:t xml:space="preserve">aren’t as </w:t>
-      </w:r>
-      <w:r>
-        <w:t xml:space="preserve">graphic design </w:t>
-      </w:r>
-      <w:r>
-        <w:t>centric.</w:t>
-      </w:r>
-      <w:r>
-        <w:t xml:space="preserve"> </w:t>
-      </w:r>
-    </w:p>
-    <w:p>
-      <w:r>
-        <w:t>Although tailwind comes with many benefits,</w:t>
-      </w:r>
-      <w:r>
-        <w:t xml:space="preserve"> </w:t>
-      </w:r>
-      <w:r>
-        <w:t>o</w:t>
-      </w:r>
-      <w:r>
-        <w:t xml:space="preserve">ne pretty significant downside </w:t>
-      </w:r>
-      <w:r>
-        <w:t xml:space="preserve">to tailwind is how complicated some elements can become. Defining </w:t>
-      </w:r>
-      <w:r>
-        <w:t xml:space="preserve">CSS </w:t>
-      </w:r>
-      <w:r>
-        <w:t xml:space="preserve">classes directly in the elements can cause them </w:t>
-      </w:r>
-      <w:r>
-        <w:t xml:space="preserve">to become </w:t>
-      </w:r>
-      <w:r>
-        <w:t>extremely bloated</w:t>
-      </w:r>
-      <w:r>
-        <w:t xml:space="preserve"> and hard to read.</w:t>
-      </w:r>
-    </w:p>
-    <w:p>
-      <w:r>
-        <w:t xml:space="preserve">Daisy UI is a tailwind </w:t>
-      </w:r>
-      <w:r>
-        <w:t>CSS</w:t>
-      </w:r>
-      <w:r>
-        <w:t xml:space="preserve"> </w:t>
-      </w:r>
-      <w:r>
-        <w:t>plugin that comes with pre-made components that can be</w:t>
-      </w:r>
-      <w:r>
-        <w:t xml:space="preserve"> </w:t>
-      </w:r>
-      <w:r>
-        <w:t>used as drop-in replacements for the default html elements.</w:t>
-      </w:r>
-      <w:r>
-        <w:t xml:space="preserve"> All that is necessary to use </w:t>
-      </w:r>
-      <w:r>
-        <w:t>a</w:t>
-      </w:r>
-      <w:r>
-        <w:t xml:space="preserve"> component is</w:t>
-      </w:r>
-      <w:r>
-        <w:t xml:space="preserve"> incl</w:t>
-      </w:r>
-      <w:r>
-        <w:t xml:space="preserve">uding its name </w:t>
-      </w:r>
-      <w:r>
-        <w:t>in the class definition of the element chosen.</w:t>
-      </w:r>
-      <w:r>
-        <w:t xml:space="preserve"> </w:t>
-      </w:r>
-      <w:r>
-        <w:t xml:space="preserve"> </w:t>
-      </w:r>
-    </w:p>
-    <w:p>
-      <w:pPr>
-        <w:pStyle w:val="Heading2"/>
-      </w:pPr>
-      <w:bookmarkStart w:id="31" w:name="_Toc196607738"/>
+      <w:bookmarkStart w:id="31" w:name="_Toc196608756"/>
       <w:r>
         <w:lastRenderedPageBreak/>
         <w:t>Other Languages</w:t>
@@ -7437,7 +7363,7 @@
       <w:pPr>
         <w:pStyle w:val="Heading2"/>
       </w:pPr>
-      <w:bookmarkStart w:id="32" w:name="_Toc196607739"/>
+      <w:bookmarkStart w:id="32" w:name="_Toc196608757"/>
       <w:r>
         <w:t>Python</w:t>
       </w:r>
@@ -7706,7 +7632,7 @@
       <w:pPr>
         <w:pStyle w:val="Heading2"/>
       </w:pPr>
-      <w:bookmarkStart w:id="33" w:name="_Toc196607740"/>
+      <w:bookmarkStart w:id="33" w:name="_Toc196608758"/>
       <w:r>
         <w:t xml:space="preserve">The </w:t>
       </w:r>
@@ -7763,7 +7689,7 @@
       <w:pPr>
         <w:pStyle w:val="Heading2"/>
       </w:pPr>
-      <w:bookmarkStart w:id="34" w:name="_Toc196607741"/>
+      <w:bookmarkStart w:id="34" w:name="_Toc196608759"/>
       <w:r>
         <w:t>MQTT and Alternative Server Protocols</w:t>
       </w:r>
@@ -7854,7 +7780,7 @@
       <w:pPr>
         <w:pStyle w:val="Heading2"/>
       </w:pPr>
-      <w:bookmarkStart w:id="35" w:name="_Toc196607742"/>
+      <w:bookmarkStart w:id="35" w:name="_Toc196608760"/>
       <w:r>
         <w:t>Sockets and web-sockets</w:t>
       </w:r>
@@ -8035,9 +7961,9 @@
           <w:noProof/>
         </w:rPr>
         <w:drawing>
-          <wp:inline distT="0" distB="0" distL="0" distR="0" wp14:anchorId="1F938754" wp14:editId="23343669">
-            <wp:extent cx="3162300" cy="3602622"/>
-            <wp:effectExtent l="0" t="0" r="0" b="0"/>
+          <wp:inline distT="0" distB="0" distL="0" distR="0" wp14:anchorId="1F938754" wp14:editId="3D848E4C">
+            <wp:extent cx="3505200" cy="3993267"/>
+            <wp:effectExtent l="0" t="0" r="0" b="7620"/>
             <wp:docPr id="1941405995" name="Picture 1" descr="A diagram of a process&#10;&#10;AI-generated content may be incorrect."/>
             <wp:cNvGraphicFramePr>
               <a:graphicFrameLocks xmlns:a="http://schemas.openxmlformats.org/drawingml/2006/main" noChangeAspect="1"/>
@@ -8067,7 +7993,7 @@
                   <pic:spPr bwMode="auto">
                     <a:xfrm>
                       <a:off x="0" y="0"/>
-                      <a:ext cx="3191241" cy="3635592"/>
+                      <a:ext cx="3546731" cy="4040581"/>
                     </a:xfrm>
                     <a:prstGeom prst="rect">
                       <a:avLst/>
@@ -8088,7 +8014,7 @@
       <w:pPr>
         <w:pStyle w:val="Heading2"/>
       </w:pPr>
-      <w:bookmarkStart w:id="36" w:name="_Toc196607743"/>
+      <w:bookmarkStart w:id="36" w:name="_Toc196608761"/>
       <w:r>
         <w:lastRenderedPageBreak/>
         <w:t>Server Functions</w:t>
@@ -8114,7 +8040,7 @@
       <w:pPr>
         <w:pStyle w:val="Heading1"/>
       </w:pPr>
-      <w:bookmarkStart w:id="37" w:name="_Toc196607744"/>
+      <w:bookmarkStart w:id="37" w:name="_Toc196608762"/>
       <w:r>
         <w:t>Comparing</w:t>
       </w:r>
@@ -8134,10 +8060,10 @@
         <w:t xml:space="preserve"> 3 key ones stand out above the rest and are relied on by many different organisations for their backend requirements.</w:t>
       </w:r>
       <w:r>
-        <w:t xml:space="preserve"> These 3 </w:t>
-      </w:r>
-      <w:r>
-        <w:t xml:space="preserve">key </w:t>
+        <w:t xml:space="preserve"> These 3</w:t>
+      </w:r>
+      <w:r>
+        <w:t xml:space="preserve"> </w:t>
       </w:r>
       <w:r>
         <w:t xml:space="preserve">systems </w:t>
@@ -8153,7 +8079,7 @@
       <w:pPr>
         <w:pStyle w:val="Heading2"/>
       </w:pPr>
-      <w:bookmarkStart w:id="38" w:name="_Toc196607745"/>
+      <w:bookmarkStart w:id="38" w:name="_Toc196608763"/>
       <w:r>
         <w:t>Django</w:t>
       </w:r>
@@ -8182,7 +8108,13 @@
         <w:t xml:space="preserve"> Django p</w:t>
       </w:r>
       <w:r>
-        <w:t>ower the</w:t>
+        <w:t>ower</w:t>
+      </w:r>
+      <w:r>
+        <w:t>s</w:t>
+      </w:r>
+      <w:r>
+        <w:t xml:space="preserve"> the</w:t>
       </w:r>
       <w:r>
         <w:t xml:space="preserve"> backends of the</w:t>
@@ -8195,7 +8127,7 @@
       <w:pPr>
         <w:pStyle w:val="Heading2"/>
       </w:pPr>
-      <w:bookmarkStart w:id="39" w:name="_Toc196607746"/>
+      <w:bookmarkStart w:id="39" w:name="_Toc196608764"/>
       <w:r>
         <w:t>Fast API</w:t>
       </w:r>
@@ -8243,7 +8175,7 @@
       <w:pPr>
         <w:pStyle w:val="Heading2"/>
       </w:pPr>
-      <w:bookmarkStart w:id="40" w:name="_Toc196607747"/>
+      <w:bookmarkStart w:id="40" w:name="_Toc196608765"/>
       <w:r>
         <w:t>Flask</w:t>
       </w:r>
@@ -8268,306 +8200,328 @@
       <w:r>
         <w:t>Taking advantage of how simple the endpoints are for flask, extending functionality was made significantly easier in the form of function decorating.</w:t>
       </w:r>
-    </w:p>
-    <w:p>
-      <w:r>
-        <w:t>Decorator functions are used throughout the project to integrate into the authentication system. The decorators live above the functions and are called just before the function is called. This allows processes to occur such as checking if the user calling the function is authenticated, before allowing them access to it.</w:t>
-      </w:r>
-    </w:p>
-    <w:p>
+      <w:r>
+        <w:t xml:space="preserve"> </w:t>
+      </w:r>
+      <w:r>
+        <w:t xml:space="preserve">Decorator functions are used throughout the project </w:t>
+      </w:r>
+      <w:r>
+        <w:t>for the</w:t>
+      </w:r>
+      <w:r>
+        <w:t xml:space="preserve"> integrat</w:t>
+      </w:r>
+      <w:r>
+        <w:t>ion</w:t>
+      </w:r>
+      <w:r>
+        <w:t xml:space="preserve"> of</w:t>
+      </w:r>
+      <w:r>
+        <w:t xml:space="preserve"> the authentication system. The decorators live above the functions and are called just before the function is called. This allows processes to occur such as checking if the user calling the function is authenticated, before allowing them access to it.</w:t>
+      </w:r>
+    </w:p>
+    <w:p>
+      <w:r>
+        <w:t>(show decorator)</w:t>
+      </w:r>
+    </w:p>
+    <w:p>
+      <w:pPr>
+        <w:pStyle w:val="Heading2"/>
+      </w:pPr>
+      <w:bookmarkStart w:id="41" w:name="_Toc196608766"/>
       <w:r>
         <w:lastRenderedPageBreak/>
-        <w:t>(show decorator)</w:t>
+        <w:t>Authentication</w:t>
+      </w:r>
+      <w:bookmarkEnd w:id="41"/>
+    </w:p>
+    <w:p>
+      <w:r>
+        <w:t>Authentication is a large part of any application, deciding who can and can’t access it and how the user’s data is stored. The ICMS application gives users 2 options, locally storing the user data. Or storing the data in a self-hostable authentication service.</w:t>
+      </w:r>
+    </w:p>
+    <w:p>
+      <w:r>
+        <w:t xml:space="preserve">Storing the data </w:t>
+      </w:r>
+      <w:r>
+        <w:t xml:space="preserve">locally </w:t>
+      </w:r>
+      <w:r>
+        <w:t>should be fine for most users as long as the main system is utilising the correct security features of the operating system it is running on. To add a layer of security to the user data, passwords are store in their encrypted forms.</w:t>
+      </w:r>
+    </w:p>
+    <w:p>
+      <w:r>
+        <w:t>The authentication service is another simple server that runs as an API service. Utilising an SQLite database to store the user data, this method of storing data is much more developer friendly.</w:t>
+      </w:r>
+    </w:p>
+    <w:p>
+      <w:r>
+        <w:t>In order to prevent having to constantly check passwords, the applications including the store implement a token system. Tokens are session-based methods of ensuring a user is who they say they are per request to the server.</w:t>
       </w:r>
     </w:p>
     <w:p>
       <w:pPr>
         <w:pStyle w:val="Heading2"/>
       </w:pPr>
-      <w:bookmarkStart w:id="41" w:name="_Toc196607748"/>
-      <w:r>
-        <w:t>Authentication</w:t>
-      </w:r>
-      <w:bookmarkEnd w:id="41"/>
-    </w:p>
-    <w:p>
-      <w:r>
-        <w:t>Authentication is a large part of any application, deciding who can and can’t access it and how the user’s data is stored. The ICMS application gives users 2 options, locally storing the user data in a json file. Or storing the data in a self-hostable authentication service.</w:t>
-      </w:r>
-    </w:p>
-    <w:p>
-      <w:r>
-        <w:t>Storing the data as a json file should be fine for most users as long as the main system is utilising the correct security features of the operating system it is running on. To add a layer of security to the user data, passwords are store in their encrypted forms.</w:t>
-      </w:r>
-    </w:p>
-    <w:p>
-      <w:r>
-        <w:t>The authentication service is another simple server that runs as an API service. Utilising an SQLite database to store the user data, this method of storing data is much more developer friendly.</w:t>
-      </w:r>
-    </w:p>
-    <w:p>
-      <w:r>
-        <w:t>In order to prevent having to constantly check passwords, the applications including the store implement a token system. Tokens are session-based methods of ensuring a user is who they say they are per request to the server.</w:t>
+      <w:bookmarkStart w:id="42" w:name="_Toc196608767"/>
+      <w:r>
+        <w:t xml:space="preserve">JWT </w:t>
+      </w:r>
+      <w:r>
+        <w:t>T</w:t>
+      </w:r>
+      <w:r>
+        <w:t>oken</w:t>
+      </w:r>
+      <w:r>
+        <w:t>s</w:t>
+      </w:r>
+      <w:bookmarkEnd w:id="42"/>
+    </w:p>
+    <w:p>
+      <w:r>
+        <w:t xml:space="preserve">A JWT token is an internet standard way for creating and storing encoded data within a token. Within the application, JWT tokens are used to store the userID of a user. </w:t>
+      </w:r>
+      <w:r>
+        <w:t>T</w:t>
+      </w:r>
+      <w:r>
+        <w:t xml:space="preserve">he </w:t>
+      </w:r>
+      <w:r>
+        <w:t>userID</w:t>
+      </w:r>
+      <w:r>
+        <w:t xml:space="preserve"> </w:t>
+      </w:r>
+      <w:r>
+        <w:t>can then be</w:t>
+      </w:r>
+      <w:r>
+        <w:t xml:space="preserve"> used to</w:t>
+      </w:r>
+      <w:r>
+        <w:t xml:space="preserve"> match</w:t>
+      </w:r>
+      <w:r>
+        <w:t xml:space="preserve"> and</w:t>
+      </w:r>
+      <w:r>
+        <w:t xml:space="preserve"> find the</w:t>
+      </w:r>
+      <w:r>
+        <w:t xml:space="preserve"> </w:t>
+      </w:r>
+      <w:r>
+        <w:t>relevant</w:t>
+      </w:r>
+      <w:r>
+        <w:t xml:space="preserve"> data</w:t>
+      </w:r>
+      <w:r>
+        <w:t xml:space="preserve"> for the user</w:t>
+      </w:r>
+      <w:r>
+        <w:t xml:space="preserve"> from the database or cache</w:t>
+      </w:r>
+      <w:r>
+        <w:t>.</w:t>
       </w:r>
     </w:p>
     <w:p>
       <w:pPr>
         <w:pStyle w:val="Heading2"/>
       </w:pPr>
-      <w:bookmarkStart w:id="42" w:name="_Toc196607749"/>
-      <w:r>
-        <w:t xml:space="preserve">JWT </w:t>
-      </w:r>
-      <w:r>
-        <w:t>T</w:t>
-      </w:r>
-      <w:r>
-        <w:t>oken</w:t>
-      </w:r>
-      <w:r>
-        <w:t>s</w:t>
-      </w:r>
-      <w:bookmarkEnd w:id="42"/>
-    </w:p>
-    <w:p>
-      <w:r>
-        <w:t xml:space="preserve">A JWT token is an internet standard way for creating and storing encoded data within a token. Within the application, JWT tokens are used to store the userID of a user. </w:t>
-      </w:r>
-      <w:r>
-        <w:t>T</w:t>
-      </w:r>
-      <w:r>
-        <w:t xml:space="preserve">he </w:t>
-      </w:r>
-      <w:r>
-        <w:t>userID</w:t>
+      <w:bookmarkStart w:id="43" w:name="_Toc196608768"/>
+      <w:r>
+        <w:t>Caching</w:t>
+      </w:r>
+      <w:bookmarkEnd w:id="43"/>
+    </w:p>
+    <w:p>
+      <w:r>
+        <w:t>Caching user data speeds up the application by reducing the amount of much slower IO processes that need to occur</w:t>
+      </w:r>
+      <w:r>
+        <w:t xml:space="preserve">. </w:t>
+      </w:r>
+      <w:r>
+        <w:t xml:space="preserve">An </w:t>
+      </w:r>
+      <w:r>
+        <w:t>example</w:t>
+      </w:r>
+      <w:r>
+        <w:t xml:space="preserve"> IO process is</w:t>
+      </w:r>
+      <w:r>
+        <w:t xml:space="preserve"> having </w:t>
+      </w:r>
+      <w:r>
+        <w:t xml:space="preserve">to read from a file </w:t>
+      </w:r>
+      <w:r>
+        <w:t>every time</w:t>
+      </w:r>
+      <w:r>
+        <w:t xml:space="preserve"> the user wishes to access it</w:t>
+      </w:r>
+      <w:r>
+        <w:t>, which</w:t>
+      </w:r>
+      <w:r>
+        <w:t xml:space="preserve"> is a</w:t>
       </w:r>
       <w:r>
         <w:t xml:space="preserve"> </w:t>
       </w:r>
       <w:r>
-        <w:t>can then be</w:t>
-      </w:r>
-      <w:r>
-        <w:t xml:space="preserve"> used to</w:t>
-      </w:r>
-      <w:r>
-        <w:t xml:space="preserve"> match</w:t>
-      </w:r>
-      <w:r>
-        <w:t xml:space="preserve"> and</w:t>
-      </w:r>
-      <w:r>
-        <w:t xml:space="preserve"> find the</w:t>
+        <w:t>slow process</w:t>
+      </w:r>
+      <w:r>
+        <w:t>, especially</w:t>
+      </w:r>
+      <w:r>
+        <w:t xml:space="preserve"> if it was required to be carried out for </w:t>
+      </w:r>
+      <w:r>
+        <w:t>every</w:t>
+      </w:r>
+      <w:r>
+        <w:t xml:space="preserve"> user. Instead</w:t>
+      </w:r>
+      <w:r>
+        <w:t>,</w:t>
+      </w:r>
+      <w:r>
+        <w:t xml:space="preserve"> the ICMS</w:t>
       </w:r>
       <w:r>
         <w:t xml:space="preserve"> </w:t>
       </w:r>
       <w:r>
-        <w:t>relevant</w:t>
-      </w:r>
-      <w:r>
-        <w:t xml:space="preserve"> data</w:t>
-      </w:r>
-      <w:r>
-        <w:t xml:space="preserve"> for the user</w:t>
-      </w:r>
-      <w:r>
-        <w:t xml:space="preserve"> from the database or cache</w:t>
+        <w:t xml:space="preserve">applications </w:t>
+      </w:r>
+      <w:r>
+        <w:t>retrieve th</w:t>
+      </w:r>
+      <w:r>
+        <w:t>e</w:t>
+      </w:r>
+      <w:r>
+        <w:t xml:space="preserve"> user data and store it in a list in memory</w:t>
       </w:r>
       <w:r>
         <w:t>.</w:t>
       </w:r>
     </w:p>
     <w:p>
+      <w:r>
+        <w:t>Unfortunately,</w:t>
+      </w:r>
+      <w:r>
+        <w:t xml:space="preserve"> as with all things in software development,</w:t>
+      </w:r>
+      <w:r>
+        <w:t xml:space="preserve"> u</w:t>
+      </w:r>
+      <w:r>
+        <w:t xml:space="preserve">tilising this system does come with some drawbacks, </w:t>
+      </w:r>
+      <w:r>
+        <w:t xml:space="preserve">namely </w:t>
+      </w:r>
+      <w:r>
+        <w:t>being that caching systems can be incredibly memory hungry on lower power devices</w:t>
+      </w:r>
+      <w:r>
+        <w:t xml:space="preserve"> and can cause some issues depending on the size of the total amount of data needing to be stored</w:t>
+      </w:r>
+      <w:r>
+        <w:t>.</w:t>
+      </w:r>
+      <w:r>
+        <w:t xml:space="preserve"> Another issue is determining when the user data is not going to be accessed anymore as keeping user data that has been unused for a long time becomes extremely memory inefficient.</w:t>
+      </w:r>
+      <w:r>
+        <w:t xml:space="preserve"> For</w:t>
+      </w:r>
+      <w:r>
+        <w:t xml:space="preserve"> </w:t>
+      </w:r>
+      <w:r>
+        <w:t>applications such as ICMS, it was designed</w:t>
+      </w:r>
+      <w:r>
+        <w:t xml:space="preserve"> around</w:t>
+      </w:r>
+      <w:r>
+        <w:t xml:space="preserve"> the total amount of users ideally</w:t>
+      </w:r>
+      <w:r>
+        <w:t xml:space="preserve"> </w:t>
+      </w:r>
+      <w:r>
+        <w:t xml:space="preserve">being </w:t>
+      </w:r>
+      <w:r>
+        <w:t xml:space="preserve">a low </w:t>
+      </w:r>
+      <w:r>
+        <w:t xml:space="preserve">amount, so it then </w:t>
+      </w:r>
+      <w:r>
+        <w:t xml:space="preserve">only utilises the database as a form of </w:t>
+      </w:r>
+      <w:r>
+        <w:t>a</w:t>
+      </w:r>
+      <w:r>
+        <w:t xml:space="preserve"> </w:t>
+      </w:r>
+      <w:r>
+        <w:t>backup</w:t>
+      </w:r>
+      <w:r>
+        <w:t xml:space="preserve"> for the </w:t>
+      </w:r>
+      <w:r>
+        <w:t xml:space="preserve">user </w:t>
+      </w:r>
+      <w:r>
+        <w:t>data,</w:t>
+      </w:r>
+      <w:r>
+        <w:t xml:space="preserve"> so that </w:t>
+      </w:r>
+      <w:r>
+        <w:t>it</w:t>
+      </w:r>
+      <w:r>
+        <w:t xml:space="preserve"> can be </w:t>
+      </w:r>
+      <w:r>
+        <w:t>retrieved when the application is shutdown</w:t>
+      </w:r>
+      <w:r>
+        <w:t>.</w:t>
+      </w:r>
+    </w:p>
+    <w:p>
+      <w:r>
+        <w:t>If the application were to be scaled to bigger amounts of users, the system would need to be updated to reflect that.</w:t>
+      </w:r>
+    </w:p>
+    <w:p>
       <w:pPr>
         <w:pStyle w:val="Heading2"/>
       </w:pPr>
-      <w:bookmarkStart w:id="43" w:name="_Toc196607750"/>
-      <w:r>
-        <w:t>Caching</w:t>
-      </w:r>
-      <w:bookmarkEnd w:id="43"/>
-    </w:p>
-    <w:p>
-      <w:r>
-        <w:t>Caching user data speeds up the application by reducing the amount of much slower IO processes that need to occur</w:t>
-      </w:r>
-      <w:r>
-        <w:t xml:space="preserve">. </w:t>
-      </w:r>
-      <w:r>
-        <w:t xml:space="preserve">An </w:t>
-      </w:r>
-      <w:r>
-        <w:t>example</w:t>
-      </w:r>
-      <w:r>
-        <w:t xml:space="preserve"> IO process is</w:t>
-      </w:r>
-      <w:r>
-        <w:t xml:space="preserve"> having </w:t>
-      </w:r>
-      <w:r>
-        <w:t xml:space="preserve">to read from a file </w:t>
-      </w:r>
-      <w:r>
-        <w:t>every time</w:t>
-      </w:r>
-      <w:r>
-        <w:t xml:space="preserve"> the user wishes to access it</w:t>
-      </w:r>
-      <w:r>
-        <w:t>, which</w:t>
-      </w:r>
-      <w:r>
-        <w:t xml:space="preserve"> is a</w:t>
-      </w:r>
-      <w:r>
-        <w:t xml:space="preserve"> </w:t>
-      </w:r>
-      <w:r>
-        <w:t>slow process</w:t>
-      </w:r>
-      <w:r>
-        <w:t>, especially</w:t>
-      </w:r>
-      <w:r>
-        <w:t xml:space="preserve"> if it was required to be carried out for </w:t>
-      </w:r>
-      <w:r>
-        <w:t>every</w:t>
-      </w:r>
-      <w:r>
-        <w:t xml:space="preserve"> user. Instead</w:t>
-      </w:r>
-      <w:r>
-        <w:t>,</w:t>
-      </w:r>
-      <w:r>
-        <w:t xml:space="preserve"> the ICMS</w:t>
-      </w:r>
-      <w:r>
-        <w:t xml:space="preserve"> </w:t>
-      </w:r>
-      <w:r>
-        <w:t xml:space="preserve">applications </w:t>
-      </w:r>
-      <w:r>
-        <w:t>retrieve th</w:t>
-      </w:r>
-      <w:r>
-        <w:t>e</w:t>
-      </w:r>
-      <w:r>
-        <w:t xml:space="preserve"> user data and store it in a list in memory</w:t>
-      </w:r>
-      <w:r>
-        <w:t>.</w:t>
-      </w:r>
-    </w:p>
-    <w:p>
-      <w:r>
-        <w:t>Unfortunately,</w:t>
-      </w:r>
-      <w:r>
-        <w:t xml:space="preserve"> as with all things in software development,</w:t>
-      </w:r>
-      <w:r>
-        <w:t xml:space="preserve"> u</w:t>
-      </w:r>
-      <w:r>
-        <w:t xml:space="preserve">tilising this system does come with some drawbacks, </w:t>
-      </w:r>
-      <w:r>
-        <w:t xml:space="preserve">namely </w:t>
-      </w:r>
-      <w:r>
-        <w:t>being that caching systems can be incredibly memory hungry on lower power devices</w:t>
-      </w:r>
-      <w:r>
-        <w:t xml:space="preserve"> and can cause some issues depending on the size of the total amount of data needing to be stored</w:t>
-      </w:r>
-      <w:r>
-        <w:t>.</w:t>
-      </w:r>
-      <w:r>
-        <w:t xml:space="preserve"> Another issue is determining when the user data is not going to be accessed anymore as keeping user data that has been unused for a long time becomes extremely memory inefficient.</w:t>
-      </w:r>
-      <w:r>
-        <w:t xml:space="preserve"> For</w:t>
-      </w:r>
-      <w:r>
-        <w:t xml:space="preserve"> </w:t>
-      </w:r>
-      <w:r>
-        <w:t>applications such as ICMS, it was designed</w:t>
-      </w:r>
-      <w:r>
-        <w:t xml:space="preserve"> around</w:t>
-      </w:r>
-      <w:r>
-        <w:t xml:space="preserve"> the total amount of users ideally</w:t>
-      </w:r>
-      <w:r>
-        <w:t xml:space="preserve"> </w:t>
-      </w:r>
-      <w:r>
-        <w:t xml:space="preserve">being </w:t>
-      </w:r>
-      <w:r>
-        <w:t xml:space="preserve">a low </w:t>
-      </w:r>
-      <w:r>
-        <w:t xml:space="preserve">amount, so it then </w:t>
-      </w:r>
-      <w:r>
-        <w:t xml:space="preserve">only utilises the database as a form of </w:t>
-      </w:r>
-      <w:r>
-        <w:t>a</w:t>
-      </w:r>
-      <w:r>
-        <w:t xml:space="preserve"> </w:t>
-      </w:r>
-      <w:r>
-        <w:t>backup</w:t>
-      </w:r>
-      <w:r>
-        <w:t xml:space="preserve"> for the </w:t>
-      </w:r>
-      <w:r>
-        <w:t xml:space="preserve">user </w:t>
-      </w:r>
-      <w:r>
-        <w:t>data,</w:t>
-      </w:r>
-      <w:r>
-        <w:t xml:space="preserve"> so that </w:t>
-      </w:r>
-      <w:r>
-        <w:t>it</w:t>
-      </w:r>
-      <w:r>
-        <w:t xml:space="preserve"> can be </w:t>
-      </w:r>
-      <w:r>
-        <w:t>retrieved when the application is shutdown</w:t>
-      </w:r>
-      <w:r>
-        <w:t>.</w:t>
-      </w:r>
-    </w:p>
-    <w:p>
-      <w:r>
-        <w:t>If the application were to be scaled to bigger amounts of users, the system would need to be updated to reflect that.</w:t>
-      </w:r>
-    </w:p>
-    <w:p>
-      <w:pPr>
-        <w:pStyle w:val="Heading2"/>
-      </w:pPr>
-      <w:bookmarkStart w:id="44" w:name="_Toc196607751"/>
+      <w:bookmarkStart w:id="44" w:name="_Toc196608769"/>
       <w:r>
         <w:t>Database/SQLite</w:t>
       </w:r>
@@ -8643,7 +8597,7 @@
       <w:pPr>
         <w:pStyle w:val="Heading1"/>
       </w:pPr>
-      <w:bookmarkStart w:id="45" w:name="_Toc196607752"/>
+      <w:bookmarkStart w:id="45" w:name="_Toc196608770"/>
       <w:r>
         <w:t xml:space="preserve">Extending </w:t>
       </w:r>
@@ -8764,7 +8718,7 @@
       <w:pPr>
         <w:pStyle w:val="Heading2"/>
       </w:pPr>
-      <w:bookmarkStart w:id="46" w:name="_Toc196607753"/>
+      <w:bookmarkStart w:id="46" w:name="_Toc196608771"/>
       <w:r>
         <w:t>Extensions</w:t>
       </w:r>
@@ -8914,7 +8868,7 @@
         <w:pStyle w:val="Heading1"/>
       </w:pPr>
       <w:bookmarkStart w:id="47" w:name="_Testing_and_Analysis"/>
-      <w:bookmarkStart w:id="48" w:name="_Toc196607754"/>
+      <w:bookmarkStart w:id="48" w:name="_Toc196608772"/>
       <w:bookmarkEnd w:id="47"/>
       <w:r>
         <w:t xml:space="preserve">Testing </w:t>
@@ -9021,7 +8975,7 @@
       <w:pPr>
         <w:pStyle w:val="Heading2"/>
       </w:pPr>
-      <w:bookmarkStart w:id="49" w:name="_Toc196607755"/>
+      <w:bookmarkStart w:id="49" w:name="_Toc196608773"/>
       <w:r>
         <w:t>Usability Testing</w:t>
       </w:r>
@@ -9406,7 +9360,7 @@
       <w:pPr>
         <w:pStyle w:val="Heading2"/>
       </w:pPr>
-      <w:bookmarkStart w:id="50" w:name="_Toc196607756"/>
+      <w:bookmarkStart w:id="50" w:name="_Toc196608774"/>
       <w:r>
         <w:t>Feedback</w:t>
       </w:r>
@@ -9425,7 +9379,7 @@
       <w:pPr>
         <w:pStyle w:val="Heading2"/>
       </w:pPr>
-      <w:bookmarkStart w:id="51" w:name="_Toc196607757"/>
+      <w:bookmarkStart w:id="51" w:name="_Toc196608775"/>
       <w:r>
         <w:lastRenderedPageBreak/>
         <w:t xml:space="preserve">Ease of development vs </w:t>
@@ -9449,7 +9403,7 @@
       <w:pPr>
         <w:pStyle w:val="Heading1"/>
       </w:pPr>
-      <w:bookmarkStart w:id="52" w:name="_Toc196607758"/>
+      <w:bookmarkStart w:id="52" w:name="_Toc196608776"/>
       <w:r>
         <w:t>Development Environment</w:t>
       </w:r>
@@ -9459,7 +9413,7 @@
       <w:pPr>
         <w:pStyle w:val="Heading2"/>
       </w:pPr>
-      <w:bookmarkStart w:id="53" w:name="_Toc196607759"/>
+      <w:bookmarkStart w:id="53" w:name="_Toc196608777"/>
       <w:r>
         <w:t>Hosting and improving on ease of use</w:t>
       </w:r>
@@ -9480,7 +9434,7 @@
       <w:pPr>
         <w:pStyle w:val="Heading2"/>
       </w:pPr>
-      <w:bookmarkStart w:id="54" w:name="_Toc196607760"/>
+      <w:bookmarkStart w:id="54" w:name="_Toc196608778"/>
       <w:r>
         <w:t>Docker</w:t>
       </w:r>
@@ -9568,7 +9522,7 @@
       <w:pPr>
         <w:pStyle w:val="Heading2"/>
       </w:pPr>
-      <w:bookmarkStart w:id="55" w:name="_Toc196607761"/>
+      <w:bookmarkStart w:id="55" w:name="_Toc196608779"/>
       <w:r>
         <w:t>Docker</w:t>
       </w:r>
@@ -9591,12 +9545,11 @@
         <w:t xml:space="preserve"> Dockerfiles to be compiled together and run simultaneously in the same docker image. Through the image, different applications can be disabled and enabled depending on which parts the end user wishes to use. </w:t>
       </w:r>
     </w:p>
-    <w:p/>
     <w:p>
       <w:pPr>
         <w:pStyle w:val="Heading2"/>
       </w:pPr>
-      <w:bookmarkStart w:id="56" w:name="_Toc196607762"/>
+      <w:bookmarkStart w:id="56" w:name="_Toc196608780"/>
       <w:r>
         <w:t>Nginx</w:t>
       </w:r>
@@ -9631,12 +9584,16 @@
         <w:t xml:space="preserve"> This system is good for taking advantage of features such as load balancing and rate limiting.</w:t>
       </w:r>
     </w:p>
-    <w:p/>
+    <w:p>
+      <w:r>
+        <w:t>(show diagram here)</w:t>
+      </w:r>
+    </w:p>
     <w:p>
       <w:pPr>
         <w:pStyle w:val="Heading1"/>
       </w:pPr>
-      <w:bookmarkStart w:id="57" w:name="_Toc196607763"/>
+      <w:bookmarkStart w:id="57" w:name="_Toc196608781"/>
       <w:r>
         <w:lastRenderedPageBreak/>
         <w:t>Optimising The Application/Future development</w:t>
@@ -9647,7 +9604,7 @@
       <w:pPr>
         <w:pStyle w:val="Heading2"/>
       </w:pPr>
-      <w:bookmarkStart w:id="58" w:name="_Toc196607764"/>
+      <w:bookmarkStart w:id="58" w:name="_Toc196608782"/>
       <w:r>
         <w:t>Improving the store</w:t>
       </w:r>
@@ -9700,7 +9657,7 @@
       <w:pPr>
         <w:pStyle w:val="Heading2"/>
       </w:pPr>
-      <w:bookmarkStart w:id="59" w:name="_Toc196607765"/>
+      <w:bookmarkStart w:id="59" w:name="_Toc196608783"/>
       <w:r>
         <w:t xml:space="preserve">Improved </w:t>
       </w:r>
@@ -9743,7 +9700,7 @@
       <w:pPr>
         <w:pStyle w:val="Heading1"/>
       </w:pPr>
-      <w:bookmarkStart w:id="60" w:name="_Toc196607766"/>
+      <w:bookmarkStart w:id="60" w:name="_Toc196608784"/>
       <w:r>
         <w:t>Problems with development</w:t>
       </w:r>
@@ -9774,21 +9731,132 @@
       <w:pPr>
         <w:pStyle w:val="Heading1"/>
       </w:pPr>
-      <w:bookmarkStart w:id="61" w:name="_Toc196607767"/>
+      <w:bookmarkStart w:id="61" w:name="_Toc196608785"/>
       <w:r>
         <w:lastRenderedPageBreak/>
-        <w:t xml:space="preserve">Overcoming </w:t>
-      </w:r>
-      <w:r>
-        <w:t xml:space="preserve">Challenges </w:t>
-      </w:r>
-      <w:r>
-        <w:t>with</w:t>
-      </w:r>
-      <w:r>
-        <w:t xml:space="preserve"> Development</w:t>
+        <w:t xml:space="preserve">What I’ve </w:t>
+      </w:r>
+      <w:r>
+        <w:t>L</w:t>
+      </w:r>
+      <w:r>
+        <w:t>earned and</w:t>
+      </w:r>
+      <w:r>
+        <w:t xml:space="preserve"> I</w:t>
+      </w:r>
+      <w:r>
+        <w:t xml:space="preserve">mproved </w:t>
+      </w:r>
+      <w:r>
+        <w:t>D</w:t>
+      </w:r>
+      <w:r>
+        <w:t xml:space="preserve">uring the </w:t>
+      </w:r>
+      <w:r>
+        <w:t>P</w:t>
+      </w:r>
+      <w:r>
+        <w:t>roject</w:t>
       </w:r>
       <w:bookmarkEnd w:id="61"/>
+    </w:p>
+    <w:p>
+      <w:r>
+        <w:t>This project has been an immense undertaking and</w:t>
+      </w:r>
+      <w:r>
+        <w:t xml:space="preserve"> one of the biggest </w:t>
+      </w:r>
+      <w:r>
+        <w:t>take-</w:t>
+      </w:r>
+      <w:r>
+        <w:t>aways from the project is that</w:t>
+      </w:r>
+      <w:r>
+        <w:t xml:space="preserve"> many features haven needed to be cut or modified to fit within the deadline</w:t>
+      </w:r>
+      <w:r>
+        <w:t>.</w:t>
+      </w:r>
+      <w:r>
+        <w:t xml:space="preserve"> Conforming to deadlines </w:t>
+      </w:r>
+      <w:r>
+        <w:t xml:space="preserve"> </w:t>
+      </w:r>
+      <w:r>
+        <w:t>is always important in big projects in the professional world.</w:t>
+      </w:r>
+    </w:p>
+    <w:p>
+      <w:pPr>
+        <w:pStyle w:val="Heading1"/>
+      </w:pPr>
+      <w:bookmarkStart w:id="62" w:name="_Toc196608786"/>
+      <w:r>
+        <w:t>Final thoughts and discussion</w:t>
+      </w:r>
+      <w:bookmarkEnd w:id="62"/>
+    </w:p>
+    <w:p>
+      <w:r>
+        <w:t>The market for these devices and the software written for them is massive</w:t>
+      </w:r>
+      <w:r>
+        <w:t xml:space="preserve">, </w:t>
+      </w:r>
+    </w:p>
+    <w:p/>
+    <w:p/>
+    <w:p>
+      <w:r>
+        <w:t>This application doesn’t aim to fix every problem but a select few</w:t>
+      </w:r>
+      <w:r>
+        <w:t>. With any application being developed, feature creep is inevitable</w:t>
+      </w:r>
+      <w:r>
+        <w:t>.</w:t>
+      </w:r>
+      <w:r>
+        <w:t xml:space="preserve"> </w:t>
+      </w:r>
+      <w:r>
+        <w:t xml:space="preserve">When designing the </w:t>
+      </w:r>
+      <w:r>
+        <w:t>project,</w:t>
+      </w:r>
+      <w:r>
+        <w:t xml:space="preserve"> it was especially important to not let too many features be added</w:t>
+      </w:r>
+      <w:r>
+        <w:t xml:space="preserve"> </w:t>
+      </w:r>
+      <w:r>
+        <w:t>because the project was</w:t>
+      </w:r>
+      <w:r>
+        <w:t xml:space="preserve"> never</w:t>
+      </w:r>
+      <w:r>
+        <w:t xml:space="preserve"> designed to actually fix </w:t>
+      </w:r>
+      <w:r>
+        <w:t xml:space="preserve">all the </w:t>
+      </w:r>
+      <w:r>
+        <w:t>problem</w:t>
+      </w:r>
+      <w:r>
+        <w:t>s</w:t>
+      </w:r>
+      <w:r>
+        <w:t xml:space="preserve"> found within the design and development of IOT devices. This application was designed to host and manage code written for a central server and allow different devices connected to it access and call that code.</w:t>
+      </w:r>
     </w:p>
     <w:p/>
     <w:p/>
@@ -9802,150 +9870,11 @@
       <w:pPr>
         <w:pStyle w:val="Heading1"/>
       </w:pPr>
-      <w:bookmarkStart w:id="62" w:name="_Toc196607768"/>
-      <w:r>
-        <w:t xml:space="preserve">What I’ve </w:t>
-      </w:r>
-      <w:r>
-        <w:t>L</w:t>
-      </w:r>
-      <w:r>
-        <w:t>earned and</w:t>
-      </w:r>
-      <w:r>
-        <w:t xml:space="preserve"> I</w:t>
-      </w:r>
-      <w:r>
-        <w:t xml:space="preserve">mproved </w:t>
-      </w:r>
-      <w:r>
-        <w:t>D</w:t>
-      </w:r>
-      <w:r>
-        <w:t xml:space="preserve">uring the </w:t>
-      </w:r>
-      <w:r>
-        <w:t>P</w:t>
-      </w:r>
-      <w:r>
-        <w:t>roject</w:t>
-      </w:r>
-      <w:bookmarkEnd w:id="62"/>
-    </w:p>
-    <w:p>
-      <w:r>
-        <w:t>This project has been an immense undertaking and</w:t>
-      </w:r>
-      <w:r>
-        <w:t xml:space="preserve"> one of the biggest </w:t>
-      </w:r>
-      <w:r>
-        <w:t>take-</w:t>
-      </w:r>
-      <w:r>
-        <w:t>aways from the project is that</w:t>
-      </w:r>
-      <w:r>
-        <w:t xml:space="preserve"> many features haven needed to be cut or modified to fit within the deadline</w:t>
-      </w:r>
-      <w:r>
-        <w:t>.</w:t>
-      </w:r>
-      <w:r>
-        <w:t xml:space="preserve"> Conforming to deadlines </w:t>
-      </w:r>
-      <w:r>
-        <w:t xml:space="preserve"> </w:t>
-      </w:r>
-      <w:r>
-        <w:t>is always important in big projects in the professional world.</w:t>
-      </w:r>
-    </w:p>
-    <w:p>
-      <w:pPr>
-        <w:pStyle w:val="Heading1"/>
-      </w:pPr>
-      <w:bookmarkStart w:id="63" w:name="_Toc196607769"/>
-      <w:r>
-        <w:t>Final thoughts and discussion</w:t>
+      <w:bookmarkStart w:id="63" w:name="_Toc196608787"/>
+      <w:r>
+        <w:t>Refences</w:t>
       </w:r>
       <w:bookmarkEnd w:id="63"/>
-    </w:p>
-    <w:p>
-      <w:r>
-        <w:t>The market for these devices and the software written for them is massive</w:t>
-      </w:r>
-      <w:r>
-        <w:t xml:space="preserve">, </w:t>
-      </w:r>
-    </w:p>
-    <w:p/>
-    <w:p/>
-    <w:p>
-      <w:r>
-        <w:t>This application doesn’t aim to fix every problem but a select few</w:t>
-      </w:r>
-      <w:r>
-        <w:t>. With any application being developed, feature creep is inevitable</w:t>
-      </w:r>
-      <w:r>
-        <w:t>.</w:t>
-      </w:r>
-      <w:r>
-        <w:t xml:space="preserve"> </w:t>
-      </w:r>
-      <w:r>
-        <w:t xml:space="preserve">When designing the </w:t>
-      </w:r>
-      <w:r>
-        <w:t>project,</w:t>
-      </w:r>
-      <w:r>
-        <w:t xml:space="preserve"> it was especially important to not let too many features be added</w:t>
-      </w:r>
-      <w:r>
-        <w:t xml:space="preserve"> </w:t>
-      </w:r>
-      <w:r>
-        <w:t>because the project was</w:t>
-      </w:r>
-      <w:r>
-        <w:t xml:space="preserve"> never</w:t>
-      </w:r>
-      <w:r>
-        <w:t xml:space="preserve"> designed to actually fix </w:t>
-      </w:r>
-      <w:r>
-        <w:t xml:space="preserve">all the </w:t>
-      </w:r>
-      <w:r>
-        <w:t>problem</w:t>
-      </w:r>
-      <w:r>
-        <w:t>s</w:t>
-      </w:r>
-      <w:r>
-        <w:t xml:space="preserve"> found within the design and development of IOT devices. This application was designed to host and manage code written for a central server and allow different devices connected to it access and call that code.</w:t>
-      </w:r>
-    </w:p>
-    <w:p/>
-    <w:p/>
-    <w:p/>
-    <w:p/>
-    <w:p/>
-    <w:p/>
-    <w:p/>
-    <w:p/>
-    <w:p>
-      <w:pPr>
-        <w:pStyle w:val="Heading1"/>
-      </w:pPr>
-      <w:bookmarkStart w:id="64" w:name="_Toc196607770"/>
-      <w:r>
-        <w:lastRenderedPageBreak/>
-        <w:t>Refences</w:t>
-      </w:r>
-      <w:bookmarkEnd w:id="64"/>
     </w:p>
     <w:p>
       <w:r>

</xml_diff>